<commit_message>
Fixed grant numbers in both versions
</commit_message>
<xml_diff>
--- a/manuscript/Cushings-Obesity/manuscript-medrxiv.docx
+++ b/manuscript/Cushings-Obesity/manuscript-medrxiv.docx
@@ -35258,7 +35258,21 @@
           <w:sz w:val="22"/>
           <w:szCs w:val="22"/>
         </w:rPr>
-        <w:t xml:space="preserve"> the University of Michigan Adipose Tissue Core, part of the Michigan Nutrition and Obesity Research Center (NIH P30DK020572).  This work was also supported by AI and Digital Health Innovation at the University of Michigan, and the University of Michigan Medical School Data Office for Clinical and Translational Research for providing data storage, management, processing, and distribution services.  Finally</w:t>
+        <w:t xml:space="preserve"> the University of Michigan Adipose Tissue Core, part of the Michigan Nutrition and Obesity Research Center (NIH P30</w:t>
+      </w:r>
+      <w:r>
+        <w:rPr>
+          <w:sz w:val="22"/>
+          <w:szCs w:val="22"/>
+        </w:rPr>
+        <w:t>DK089503</w:t>
+      </w:r>
+      <w:r>
+        <w:rPr>
+          <w:sz w:val="22"/>
+          <w:szCs w:val="22"/>
+        </w:rPr>
+        <w:t>).  This work was also supported by AI and Digital Health Innovation at the University of Michigan, and the University of Michigan Medical School Data Office for Clinical and Translational Research for providing data storage, management, processing, and distribution services.  Finally</w:t>
       </w:r>
       <w:r>
         <w:rPr>
@@ -36575,538 +36589,6 @@
         <w:br w:type="page"/>
       </w:r>
     </w:p>
-    <w:p>
-      <w:pPr>
-        <w:pStyle w:val="Heading1"/>
-      </w:pPr>
-      <w:r>
-        <w:lastRenderedPageBreak/>
-        <w:t>Supplementary Figure and Table Legends</w:t>
-      </w:r>
-    </w:p>
-    <w:p>
-      <w:pPr>
-        <w:rPr>
-          <w:sz w:val="22"/>
-          <w:szCs w:val="22"/>
-        </w:rPr>
-      </w:pPr>
-      <w:r>
-        <w:rPr>
-          <w:b/>
-          <w:bCs/>
-          <w:sz w:val="22"/>
-          <w:szCs w:val="22"/>
-        </w:rPr>
-        <w:t>Supplementary Figure</w:t>
-      </w:r>
-      <w:r>
-        <w:rPr>
-          <w:b/>
-          <w:bCs/>
-          <w:sz w:val="22"/>
-          <w:szCs w:val="22"/>
-        </w:rPr>
-        <w:t xml:space="preserve"> </w:t>
-      </w:r>
-      <w:r>
-        <w:rPr>
-          <w:b/>
-          <w:bCs/>
-          <w:sz w:val="22"/>
-          <w:szCs w:val="22"/>
-        </w:rPr>
-        <w:t>1</w:t>
-      </w:r>
-      <w:r>
-        <w:rPr>
-          <w:b/>
-          <w:bCs/>
-          <w:sz w:val="22"/>
-          <w:szCs w:val="22"/>
-        </w:rPr>
-        <w:t>: Love plot</w:t>
-      </w:r>
-      <w:r>
-        <w:rPr>
-          <w:b/>
-          <w:bCs/>
-          <w:sz w:val="22"/>
-          <w:szCs w:val="22"/>
-        </w:rPr>
-        <w:t>s</w:t>
-      </w:r>
-      <w:r>
-        <w:rPr>
-          <w:b/>
-          <w:bCs/>
-          <w:sz w:val="22"/>
-          <w:szCs w:val="22"/>
-        </w:rPr>
-        <w:t xml:space="preserve"> </w:t>
-      </w:r>
-      <w:r>
-        <w:rPr>
-          <w:b/>
-          <w:bCs/>
-          <w:sz w:val="22"/>
-          <w:szCs w:val="22"/>
-        </w:rPr>
-        <w:t>showing</w:t>
-      </w:r>
-      <w:r>
-        <w:rPr>
-          <w:b/>
-          <w:bCs/>
-          <w:sz w:val="22"/>
-          <w:szCs w:val="22"/>
-        </w:rPr>
-        <w:t xml:space="preserve"> </w:t>
-      </w:r>
-      <w:r>
-        <w:rPr>
-          <w:b/>
-          <w:bCs/>
-          <w:sz w:val="22"/>
-          <w:szCs w:val="22"/>
-        </w:rPr>
-        <w:t>covariate balance</w:t>
-      </w:r>
-      <w:r>
-        <w:rPr>
-          <w:b/>
-          <w:bCs/>
-          <w:sz w:val="22"/>
-          <w:szCs w:val="22"/>
-        </w:rPr>
-        <w:t xml:space="preserve"> each outcome.</w:t>
-      </w:r>
-      <w:r>
-        <w:rPr>
-          <w:sz w:val="22"/>
-          <w:szCs w:val="22"/>
-        </w:rPr>
-        <w:t xml:space="preserve">  Plots describe the </w:t>
-      </w:r>
-      <w:r>
-        <w:rPr>
-          <w:sz w:val="22"/>
-          <w:szCs w:val="22"/>
-        </w:rPr>
-        <w:t>standardized mean difference</w:t>
-      </w:r>
-      <w:r>
-        <w:rPr>
-          <w:sz w:val="22"/>
-          <w:szCs w:val="22"/>
-        </w:rPr>
-        <w:t xml:space="preserve"> for each variable prior to- </w:t>
-      </w:r>
-      <w:r>
-        <w:rPr>
-          <w:sz w:val="22"/>
-          <w:szCs w:val="22"/>
-        </w:rPr>
-        <w:t xml:space="preserve">(dark points) </w:t>
-      </w:r>
-      <w:r>
-        <w:rPr>
-          <w:sz w:val="22"/>
-          <w:szCs w:val="22"/>
-        </w:rPr>
-        <w:t xml:space="preserve">and after </w:t>
-      </w:r>
-      <w:r>
-        <w:rPr>
-          <w:sz w:val="22"/>
-          <w:szCs w:val="22"/>
-        </w:rPr>
-        <w:t xml:space="preserve">(light points) </w:t>
-      </w:r>
-      <w:r>
-        <w:rPr>
-          <w:sz w:val="22"/>
-          <w:szCs w:val="22"/>
-        </w:rPr>
-        <w:t xml:space="preserve">propensity </w:t>
-      </w:r>
-      <w:r>
-        <w:rPr>
-          <w:sz w:val="22"/>
-          <w:szCs w:val="22"/>
-        </w:rPr>
-        <w:t>matching</w:t>
-      </w:r>
-      <w:r>
-        <w:rPr>
-          <w:sz w:val="22"/>
-          <w:szCs w:val="22"/>
-        </w:rPr>
-        <w:t xml:space="preserve">.  </w:t>
-      </w:r>
-      <w:r>
-        <w:rPr>
-          <w:sz w:val="22"/>
-          <w:szCs w:val="22"/>
-        </w:rPr>
-        <w:t xml:space="preserve">Dashed line indicates the </w:t>
-      </w:r>
-      <w:r>
-        <w:rPr>
-          <w:sz w:val="22"/>
-          <w:szCs w:val="22"/>
-        </w:rPr>
-        <w:t xml:space="preserve">standardized mean </w:t>
-      </w:r>
-      <w:r>
-        <w:rPr>
-          <w:sz w:val="22"/>
-          <w:szCs w:val="22"/>
-        </w:rPr>
-        <w:t xml:space="preserve">difference </w:t>
-      </w:r>
-      <w:r>
-        <w:rPr>
-          <w:sz w:val="22"/>
-          <w:szCs w:val="22"/>
-        </w:rPr>
-        <w:t>cutoff</w:t>
-      </w:r>
-      <w:r>
-        <w:rPr>
-          <w:sz w:val="22"/>
-          <w:szCs w:val="22"/>
-        </w:rPr>
-        <w:t xml:space="preserve"> of </w:t>
-      </w:r>
-      <w:r>
-        <w:rPr>
-          <w:sz w:val="22"/>
-          <w:szCs w:val="22"/>
-        </w:rPr>
-        <w:t xml:space="preserve">0.1.  </w:t>
-      </w:r>
-      <w:r>
-        <w:rPr>
-          <w:sz w:val="22"/>
-          <w:szCs w:val="22"/>
-        </w:rPr>
-        <w:t xml:space="preserve">Note </w:t>
-      </w:r>
-      <w:r>
-        <w:rPr>
-          <w:sz w:val="22"/>
-          <w:szCs w:val="22"/>
-        </w:rPr>
-        <w:t xml:space="preserve">that </w:t>
-      </w:r>
-      <w:r>
-        <w:rPr>
-          <w:sz w:val="22"/>
-          <w:szCs w:val="22"/>
-        </w:rPr>
-        <w:t xml:space="preserve">age, </w:t>
-      </w:r>
-      <w:r>
-        <w:rPr>
-          <w:sz w:val="22"/>
-          <w:szCs w:val="22"/>
-        </w:rPr>
-        <w:t>race/</w:t>
-      </w:r>
-      <w:r>
-        <w:rPr>
-          <w:sz w:val="22"/>
-          <w:szCs w:val="22"/>
-        </w:rPr>
-        <w:t>ethnicity and gender were all exactly matched.</w:t>
-      </w:r>
-    </w:p>
-    <w:p>
-      <w:pPr>
-        <w:rPr>
-          <w:sz w:val="22"/>
-          <w:szCs w:val="22"/>
-        </w:rPr>
-      </w:pPr>
-      <w:r>
-        <w:rPr>
-          <w:b/>
-          <w:bCs/>
-          <w:sz w:val="22"/>
-          <w:szCs w:val="22"/>
-        </w:rPr>
-        <w:t xml:space="preserve">Supplementary Table S1: </w:t>
-      </w:r>
-      <w:r>
-        <w:rPr>
-          <w:b/>
-          <w:bCs/>
-          <w:sz w:val="22"/>
-          <w:szCs w:val="22"/>
-        </w:rPr>
-        <w:t>Covariate m</w:t>
-      </w:r>
-      <w:r>
-        <w:rPr>
-          <w:b/>
-          <w:bCs/>
-          <w:sz w:val="22"/>
-          <w:szCs w:val="22"/>
-        </w:rPr>
-        <w:t>atching diagnostics for age.</w:t>
-      </w:r>
-      <w:r>
-        <w:rPr>
-          <w:sz w:val="22"/>
-          <w:szCs w:val="22"/>
-        </w:rPr>
-        <w:t xml:space="preserve">  Averages, standard </w:t>
-      </w:r>
-      <w:r>
-        <w:rPr>
-          <w:sz w:val="22"/>
-          <w:szCs w:val="22"/>
-        </w:rPr>
-        <w:t>errors</w:t>
-      </w:r>
-      <w:r>
-        <w:rPr>
-          <w:sz w:val="22"/>
-          <w:szCs w:val="22"/>
-        </w:rPr>
-        <w:t xml:space="preserve"> and standardized mean difference for age are shown for each outcome before and after propensity matching.  Matching was exact for race and ethnicity.</w:t>
-      </w:r>
-    </w:p>
-    <w:p>
-      <w:pPr>
-        <w:rPr>
-          <w:sz w:val="22"/>
-          <w:szCs w:val="22"/>
-        </w:rPr>
-      </w:pPr>
-      <w:r>
-        <w:rPr>
-          <w:b/>
-          <w:bCs/>
-          <w:sz w:val="22"/>
-          <w:szCs w:val="22"/>
-        </w:rPr>
-        <w:t>Supplementary Tables S2</w:t>
-      </w:r>
-      <w:r>
-        <w:rPr>
-          <w:b/>
-          <w:bCs/>
-          <w:sz w:val="22"/>
-          <w:szCs w:val="22"/>
-        </w:rPr>
-        <w:t>-6</w:t>
-      </w:r>
-      <w:r>
-        <w:rPr>
-          <w:b/>
-          <w:bCs/>
-          <w:sz w:val="22"/>
-          <w:szCs w:val="22"/>
-        </w:rPr>
-        <w:t>: Outcome-specific participant characteristics after matching</w:t>
-      </w:r>
-      <w:r>
-        <w:rPr>
-          <w:sz w:val="22"/>
-          <w:szCs w:val="22"/>
-        </w:rPr>
-        <w:t xml:space="preserve">. </w:t>
-      </w:r>
-      <w:r>
-        <w:rPr>
-          <w:sz w:val="22"/>
-          <w:szCs w:val="22"/>
-        </w:rPr>
-        <w:t xml:space="preserve">Since propensity matching was completed for each Cushing’s patient with a laboratory value, the specific demographic </w:t>
-      </w:r>
-      <w:proofErr w:type="gramStart"/>
-      <w:r>
-        <w:rPr>
-          <w:sz w:val="22"/>
-          <w:szCs w:val="22"/>
-        </w:rPr>
-        <w:t>characteristics</w:t>
-      </w:r>
-      <w:proofErr w:type="gramEnd"/>
-      <w:r>
-        <w:rPr>
-          <w:sz w:val="22"/>
-          <w:szCs w:val="22"/>
-        </w:rPr>
-        <w:t xml:space="preserve"> for each analysis varies.  </w:t>
-      </w:r>
-      <w:r>
-        <w:rPr>
-          <w:sz w:val="22"/>
-          <w:szCs w:val="22"/>
-        </w:rPr>
-        <w:t xml:space="preserve">For each analysis we report the demographics of those patients for </w:t>
-      </w:r>
-      <w:r>
-        <w:rPr>
-          <w:sz w:val="22"/>
-          <w:szCs w:val="22"/>
-        </w:rPr>
-        <w:t>[</w:t>
-      </w:r>
-      <w:r>
-        <w:rPr>
-          <w:sz w:val="22"/>
-          <w:szCs w:val="22"/>
-        </w:rPr>
-        <w:t>S2</w:t>
-      </w:r>
-      <w:r>
-        <w:rPr>
-          <w:sz w:val="22"/>
-          <w:szCs w:val="22"/>
-        </w:rPr>
-        <w:t>]</w:t>
-      </w:r>
-      <w:r>
-        <w:rPr>
-          <w:sz w:val="22"/>
-          <w:szCs w:val="22"/>
-        </w:rPr>
-        <w:t xml:space="preserve"> Glucose, </w:t>
-      </w:r>
-      <w:r>
-        <w:rPr>
-          <w:sz w:val="22"/>
-          <w:szCs w:val="22"/>
-        </w:rPr>
-        <w:t>[</w:t>
-      </w:r>
-      <w:r>
-        <w:rPr>
-          <w:sz w:val="22"/>
-          <w:szCs w:val="22"/>
-        </w:rPr>
-        <w:t>S3</w:t>
-      </w:r>
-      <w:r>
-        <w:rPr>
-          <w:sz w:val="22"/>
-          <w:szCs w:val="22"/>
-        </w:rPr>
-        <w:t>]</w:t>
-      </w:r>
-      <w:r>
-        <w:rPr>
-          <w:sz w:val="22"/>
-          <w:szCs w:val="22"/>
-        </w:rPr>
-        <w:t xml:space="preserve"> HbA1c, </w:t>
-      </w:r>
-      <w:r>
-        <w:rPr>
-          <w:sz w:val="22"/>
-          <w:szCs w:val="22"/>
-        </w:rPr>
-        <w:t>[</w:t>
-      </w:r>
-      <w:r>
-        <w:rPr>
-          <w:sz w:val="22"/>
-          <w:szCs w:val="22"/>
-        </w:rPr>
-        <w:t>S4</w:t>
-      </w:r>
-      <w:r>
-        <w:rPr>
-          <w:sz w:val="22"/>
-          <w:szCs w:val="22"/>
-        </w:rPr>
-        <w:t>]</w:t>
-      </w:r>
-      <w:r>
-        <w:rPr>
-          <w:sz w:val="22"/>
-          <w:szCs w:val="22"/>
-        </w:rPr>
-        <w:t xml:space="preserve"> ALT, </w:t>
-      </w:r>
-      <w:r>
-        <w:rPr>
-          <w:sz w:val="22"/>
-          <w:szCs w:val="22"/>
-        </w:rPr>
-        <w:t>[S5]</w:t>
-      </w:r>
-      <w:r>
-        <w:rPr>
-          <w:sz w:val="22"/>
-          <w:szCs w:val="22"/>
-        </w:rPr>
-        <w:t xml:space="preserve"> </w:t>
-      </w:r>
-      <w:r>
-        <w:rPr>
-          <w:sz w:val="22"/>
-          <w:szCs w:val="22"/>
-        </w:rPr>
-        <w:t>AST</w:t>
-      </w:r>
-      <w:r>
-        <w:rPr>
-          <w:sz w:val="22"/>
-          <w:szCs w:val="22"/>
-        </w:rPr>
-        <w:t>,</w:t>
-      </w:r>
-      <w:r>
-        <w:rPr>
-          <w:sz w:val="22"/>
-          <w:szCs w:val="22"/>
-        </w:rPr>
-        <w:t xml:space="preserve"> </w:t>
-      </w:r>
-      <w:proofErr w:type="gramStart"/>
-      <w:r>
-        <w:rPr>
-          <w:sz w:val="22"/>
-          <w:szCs w:val="22"/>
-        </w:rPr>
-        <w:t>and  [</w:t>
-      </w:r>
-      <w:proofErr w:type="gramEnd"/>
-      <w:r>
-        <w:rPr>
-          <w:sz w:val="22"/>
-          <w:szCs w:val="22"/>
-        </w:rPr>
-        <w:t xml:space="preserve">S6] </w:t>
-      </w:r>
-      <w:r>
-        <w:rPr>
-          <w:sz w:val="22"/>
-          <w:szCs w:val="22"/>
-        </w:rPr>
-        <w:t>Blood Pressure</w:t>
-      </w:r>
-      <w:r>
-        <w:rPr>
-          <w:sz w:val="22"/>
-          <w:szCs w:val="22"/>
-        </w:rPr>
-        <w:t>.</w:t>
-      </w:r>
-      <w:r>
-        <w:rPr>
-          <w:sz w:val="22"/>
-          <w:szCs w:val="22"/>
-        </w:rPr>
-        <w:t xml:space="preserve"> </w:t>
-      </w:r>
-    </w:p>
-    <w:p/>
     <w:sectPr>
       <w:headerReference w:type="default" r:id="rId11"/>
       <w:pgSz w:w="12240" w:h="15840"/>

</xml_diff>

<commit_message>
Separated tables out for submission
</commit_message>
<xml_diff>
--- a/manuscript/Cushings-Obesity/manuscript-medrxiv.docx
+++ b/manuscript/Cushings-Obesity/manuscript-medrxiv.docx
@@ -2305,7 +2305,7 @@
                                     <pic:cNvPicPr/>
                                   </pic:nvPicPr>
                                   <pic:blipFill>
-                                    <a:blip r:embed="rId8">
+                                    <a:blip r:embed="rId9">
                                       <a:extLst>
                                         <a:ext uri="{28A0092B-C50C-407E-A947-70E740481C1C}">
                                           <a14:useLocalDpi xmlns:a14="http://schemas.microsoft.com/office/drawing/2010/main" val="0"/>
@@ -2649,21 +2649,161 @@
       </w:pPr>
       <w:r>
         <w:rPr>
+          <w:rStyle w:val="Strong"/>
+          <w:b w:val="0"/>
+          <w:bCs w:val="0"/>
+        </w:rPr>
+        <w:t>Participant characteristics</w:t>
+      </w:r>
+      <w:r>
+        <w:rPr>
+          <w:rStyle w:val="Strong"/>
+          <w:b w:val="0"/>
+          <w:bCs w:val="0"/>
+        </w:rPr>
+        <w:t xml:space="preserve"> </w:t>
+      </w:r>
+      <w:r>
+        <w:rPr>
+          <w:rStyle w:val="Strong"/>
+          <w:b w:val="0"/>
+          <w:bCs w:val="0"/>
+        </w:rPr>
+        <w:t xml:space="preserve">associated with </w:t>
+      </w:r>
+      <w:r>
+        <w:rPr>
+          <w:rStyle w:val="Strong"/>
+          <w:b w:val="0"/>
+          <w:bCs w:val="0"/>
+        </w:rPr>
+        <w:t xml:space="preserve">Cushing’s </w:t>
+      </w:r>
+      <w:r>
+        <w:rPr>
+          <w:rStyle w:val="Strong"/>
+          <w:b w:val="0"/>
+          <w:bCs w:val="0"/>
+        </w:rPr>
+        <w:t xml:space="preserve">disease </w:t>
+      </w:r>
+    </w:p>
+    <w:p>
+      <w:pPr>
+        <w:rPr>
+          <w:sz w:val="22"/>
+          <w:szCs w:val="22"/>
+        </w:rPr>
+      </w:pPr>
+      <w:r>
+        <w:rPr>
+          <w:sz w:val="22"/>
+          <w:szCs w:val="22"/>
+        </w:rPr>
+        <w:t xml:space="preserve">We performed outcome-specific propensity matching to identify appropriate controls, starting with generating exact matches for gender, race and ethnicity.  We then algorithmically matched for age, generating </w:t>
+      </w:r>
+      <w:r>
+        <w:rPr>
+          <w:sz w:val="22"/>
+          <w:szCs w:val="22"/>
+        </w:rPr>
+        <w:t>ten</w:t>
+      </w:r>
+      <w:r>
+        <w:rPr>
+          <w:sz w:val="22"/>
+          <w:szCs w:val="22"/>
+        </w:rPr>
+        <w:t xml:space="preserve"> controls for each case.  Matching was </w:t>
+      </w:r>
+      <w:r>
+        <w:rPr>
+          <w:sz w:val="22"/>
+          <w:szCs w:val="22"/>
+        </w:rPr>
+        <w:t>effective with</w:t>
+      </w:r>
+      <w:r>
+        <w:rPr>
+          <w:sz w:val="22"/>
+          <w:szCs w:val="22"/>
+        </w:rPr>
+        <w:t xml:space="preserve"> a </w:t>
+      </w:r>
+      <w:r>
+        <w:rPr>
+          <w:sz w:val="22"/>
+          <w:szCs w:val="22"/>
+        </w:rPr>
+        <w:t>standardized mean difference</w:t>
+      </w:r>
+      <w:r>
+        <w:rPr>
+          <w:sz w:val="22"/>
+          <w:szCs w:val="22"/>
+        </w:rPr>
+        <w:t xml:space="preserve"> for age of &lt;0.05 for each outcome (see </w:t>
+      </w:r>
+      <w:r>
+        <w:rPr>
+          <w:sz w:val="22"/>
+          <w:szCs w:val="22"/>
+        </w:rPr>
+        <w:t xml:space="preserve">Table 1, </w:t>
+      </w:r>
+      <w:r>
+        <w:rPr>
+          <w:sz w:val="22"/>
+          <w:szCs w:val="22"/>
+        </w:rPr>
+        <w:t xml:space="preserve">Supplementary </w:t>
+      </w:r>
+      <w:r>
+        <w:rPr>
+          <w:sz w:val="22"/>
+          <w:szCs w:val="22"/>
+        </w:rPr>
+        <w:t xml:space="preserve">Figure </w:t>
+      </w:r>
+      <w:r>
+        <w:rPr>
+          <w:sz w:val="22"/>
+          <w:szCs w:val="22"/>
+        </w:rPr>
+        <w:t>1</w:t>
+      </w:r>
+      <w:r>
+        <w:rPr>
+          <w:sz w:val="22"/>
+          <w:szCs w:val="22"/>
+        </w:rPr>
+        <w:t xml:space="preserve"> and Supplementary Table S1).</w:t>
+      </w:r>
+    </w:p>
+    <w:p>
+      <w:pPr>
+        <w:rPr>
+          <w:sz w:val="22"/>
+          <w:szCs w:val="22"/>
+        </w:rPr>
+      </w:pPr>
+      <w:r>
+        <w:rPr>
           <w:noProof/>
         </w:rPr>
         <mc:AlternateContent>
           <mc:Choice Requires="wps">
             <w:drawing>
-              <wp:anchor distT="0" distB="0" distL="114300" distR="114300" simplePos="0" relativeHeight="251661312" behindDoc="0" locked="0" layoutInCell="1" allowOverlap="1" wp14:anchorId="0497E870" wp14:editId="5B151116">
+              <wp:anchor distT="0" distB="0" distL="114300" distR="114300" simplePos="0" relativeHeight="251661312" behindDoc="0" locked="0" layoutInCell="1" allowOverlap="1" wp14:anchorId="0497E870" wp14:editId="05520DDE">
                 <wp:simplePos x="0" y="0"/>
                 <wp:positionH relativeFrom="column">
-                  <wp:posOffset>-65314</wp:posOffset>
+                  <wp:posOffset>-65405</wp:posOffset>
                 </wp:positionH>
                 <wp:positionV relativeFrom="paragraph">
-                  <wp:posOffset>315194</wp:posOffset>
+                  <wp:posOffset>38929</wp:posOffset>
                 </wp:positionV>
-                <wp:extent cx="3890645" cy="3442970"/>
-                <wp:effectExtent l="0" t="0" r="0" b="0"/>
+                <wp:extent cx="3890645" cy="3694430"/>
+                <wp:effectExtent l="0" t="0" r="0" b="1270"/>
                 <wp:wrapSquare wrapText="bothSides"/>
                 <wp:docPr id="1799177725" name="Text Box 1"/>
                 <wp:cNvGraphicFramePr/>
@@ -2674,7 +2814,7 @@
                       <wps:spPr>
                         <a:xfrm>
                           <a:off x="0" y="0"/>
-                          <a:ext cx="3890645" cy="3442970"/>
+                          <a:ext cx="3890645" cy="3694430"/>
                         </a:xfrm>
                         <a:prstGeom prst="rect">
                           <a:avLst/>
@@ -3915,7 +4055,11 @@
           </mc:Choice>
           <mc:Fallback>
             <w:pict>
-              <v:shape w14:anchorId="0497E870" id="_x0000_s1027" type="#_x0000_t202" style="position:absolute;margin-left:-5.15pt;margin-top:24.8pt;width:306.35pt;height:271.1pt;z-index:251661312;visibility:visible;mso-wrap-style:square;mso-width-percent:0;mso-height-percent:0;mso-wrap-distance-left:9pt;mso-wrap-distance-top:0;mso-wrap-distance-right:9pt;mso-wrap-distance-bottom:0;mso-position-horizontal:absolute;mso-position-horizontal-relative:text;mso-position-vertical:absolute;mso-position-vertical-relative:text;mso-width-percent:0;mso-height-percent:0;mso-width-relative:margin;mso-height-relative:margin;v-text-anchor:top" o:gfxdata="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" fillcolor="white [3201]" stroked="f" strokeweight=".5pt">
+              <v:shapetype w14:anchorId="0497E870" id="_x0000_t202" coordsize="21600,21600" o:spt="202" path="m,l,21600r21600,l21600,xe">
+                <v:stroke joinstyle="miter"/>
+                <v:path gradientshapeok="t" o:connecttype="rect"/>
+              </v:shapetype>
+              <v:shape id="_x0000_s1027" type="#_x0000_t202" style="position:absolute;margin-left:-5.15pt;margin-top:3.05pt;width:306.35pt;height:290.9pt;z-index:251661312;visibility:visible;mso-wrap-style:square;mso-width-percent:0;mso-height-percent:0;mso-wrap-distance-left:9pt;mso-wrap-distance-top:0;mso-wrap-distance-right:9pt;mso-wrap-distance-bottom:0;mso-position-horizontal:absolute;mso-position-horizontal-relative:text;mso-position-vertical:absolute;mso-position-vertical-relative:text;mso-width-percent:0;mso-height-percent:0;mso-width-relative:margin;mso-height-relative:margin;v-text-anchor:top" o:gfxdata="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" fillcolor="white [3201]" stroked="f" strokeweight=".5pt">
                 <v:textbox>
                   <w:txbxContent>
                     <w:p>
@@ -5131,146 +5275,6 @@
           </mc:Fallback>
         </mc:AlternateContent>
       </w:r>
-      <w:r>
-        <w:rPr>
-          <w:rStyle w:val="Strong"/>
-          <w:b w:val="0"/>
-          <w:bCs w:val="0"/>
-        </w:rPr>
-        <w:t>Participant characteristics</w:t>
-      </w:r>
-      <w:r>
-        <w:rPr>
-          <w:rStyle w:val="Strong"/>
-          <w:b w:val="0"/>
-          <w:bCs w:val="0"/>
-        </w:rPr>
-        <w:t xml:space="preserve"> </w:t>
-      </w:r>
-      <w:r>
-        <w:rPr>
-          <w:rStyle w:val="Strong"/>
-          <w:b w:val="0"/>
-          <w:bCs w:val="0"/>
-        </w:rPr>
-        <w:t xml:space="preserve">associated with </w:t>
-      </w:r>
-      <w:r>
-        <w:rPr>
-          <w:rStyle w:val="Strong"/>
-          <w:b w:val="0"/>
-          <w:bCs w:val="0"/>
-        </w:rPr>
-        <w:t xml:space="preserve">Cushing’s </w:t>
-      </w:r>
-      <w:r>
-        <w:rPr>
-          <w:rStyle w:val="Strong"/>
-          <w:b w:val="0"/>
-          <w:bCs w:val="0"/>
-        </w:rPr>
-        <w:t xml:space="preserve">disease </w:t>
-      </w:r>
-    </w:p>
-    <w:p>
-      <w:pPr>
-        <w:rPr>
-          <w:sz w:val="22"/>
-          <w:szCs w:val="22"/>
-        </w:rPr>
-      </w:pPr>
-      <w:r>
-        <w:rPr>
-          <w:sz w:val="22"/>
-          <w:szCs w:val="22"/>
-        </w:rPr>
-        <w:t xml:space="preserve">We performed outcome-specific propensity matching to identify appropriate controls, starting with generating exact matches for gender, race and ethnicity.  We then algorithmically matched for age, generating </w:t>
-      </w:r>
-      <w:r>
-        <w:rPr>
-          <w:sz w:val="22"/>
-          <w:szCs w:val="22"/>
-        </w:rPr>
-        <w:t>ten</w:t>
-      </w:r>
-      <w:r>
-        <w:rPr>
-          <w:sz w:val="22"/>
-          <w:szCs w:val="22"/>
-        </w:rPr>
-        <w:t xml:space="preserve"> controls for each case.  Matching was </w:t>
-      </w:r>
-      <w:r>
-        <w:rPr>
-          <w:sz w:val="22"/>
-          <w:szCs w:val="22"/>
-        </w:rPr>
-        <w:t>effective with</w:t>
-      </w:r>
-      <w:r>
-        <w:rPr>
-          <w:sz w:val="22"/>
-          <w:szCs w:val="22"/>
-        </w:rPr>
-        <w:t xml:space="preserve"> a </w:t>
-      </w:r>
-      <w:r>
-        <w:rPr>
-          <w:sz w:val="22"/>
-          <w:szCs w:val="22"/>
-        </w:rPr>
-        <w:t>standardized mean difference</w:t>
-      </w:r>
-      <w:r>
-        <w:rPr>
-          <w:sz w:val="22"/>
-          <w:szCs w:val="22"/>
-        </w:rPr>
-        <w:t xml:space="preserve"> for age of &lt;0.05 for each outcome (see </w:t>
-      </w:r>
-      <w:r>
-        <w:rPr>
-          <w:sz w:val="22"/>
-          <w:szCs w:val="22"/>
-        </w:rPr>
-        <w:t xml:space="preserve">Table 1, </w:t>
-      </w:r>
-      <w:r>
-        <w:rPr>
-          <w:sz w:val="22"/>
-          <w:szCs w:val="22"/>
-        </w:rPr>
-        <w:t xml:space="preserve">Supplementary </w:t>
-      </w:r>
-      <w:r>
-        <w:rPr>
-          <w:sz w:val="22"/>
-          <w:szCs w:val="22"/>
-        </w:rPr>
-        <w:t xml:space="preserve">Figure </w:t>
-      </w:r>
-      <w:r>
-        <w:rPr>
-          <w:sz w:val="22"/>
-          <w:szCs w:val="22"/>
-        </w:rPr>
-        <w:t>1</w:t>
-      </w:r>
-      <w:r>
-        <w:rPr>
-          <w:sz w:val="22"/>
-          <w:szCs w:val="22"/>
-        </w:rPr>
-        <w:t xml:space="preserve"> and Supplementary Table S1).</w:t>
-      </w:r>
-    </w:p>
-    <w:p>
-      <w:pPr>
-        <w:rPr>
-          <w:sz w:val="22"/>
-          <w:szCs w:val="22"/>
-        </w:rPr>
-      </w:pPr>
       <w:r>
         <w:rPr>
           <w:sz w:val="22"/>
@@ -10523,7 +10527,7 @@
                                           <pic:cNvPicPr/>
                                         </pic:nvPicPr>
                                         <pic:blipFill>
-                                          <a:blip r:embed="rId9">
+                                          <a:blip r:embed="rId10">
                                             <a:extLst>
                                               <a:ext uri="{28A0092B-C50C-407E-A947-70E740481C1C}">
                                                 <a14:useLocalDpi xmlns:a14="http://schemas.microsoft.com/office/drawing/2010/main" val="0"/>
@@ -10681,7 +10685,7 @@
                                     <pic:cNvPicPr/>
                                   </pic:nvPicPr>
                                   <pic:blipFill>
-                                    <a:blip r:embed="rId9">
+                                    <a:blip r:embed="rId11">
                                       <a:extLst>
                                         <a:ext uri="{28A0092B-C50C-407E-A947-70E740481C1C}">
                                           <a14:useLocalDpi xmlns:a14="http://schemas.microsoft.com/office/drawing/2010/main" val="0"/>
@@ -35311,7 +35315,7 @@
         </w:rPr>
         <w:t xml:space="preserve">All code used for this analysis is available at </w:t>
       </w:r>
-      <w:hyperlink r:id="rId10" w:history="1">
+      <w:hyperlink r:id="rId12" w:history="1">
         <w:r>
           <w:rPr>
             <w:rStyle w:val="Hyperlink"/>
@@ -35617,23 +35621,7 @@
           <w:sz w:val="22"/>
           <w:szCs w:val="22"/>
         </w:rPr>
-        <w:t xml:space="preserve">. </w:t>
-      </w:r>
-      <w:proofErr w:type="gramStart"/>
-      <w:r>
-        <w:rPr>
-          <w:sz w:val="22"/>
-          <w:szCs w:val="22"/>
-        </w:rPr>
-        <w:t>2019;10:766</w:t>
-      </w:r>
-      <w:proofErr w:type="gramEnd"/>
-      <w:r>
-        <w:rPr>
-          <w:sz w:val="22"/>
-          <w:szCs w:val="22"/>
-        </w:rPr>
-        <w:t>. doi:10.3389/fendo.2019.00766</w:t>
+        <w:t>. 2019;10:766. doi:10.3389/fendo.2019.00766</w:t>
       </w:r>
     </w:p>
     <w:p>
@@ -35713,17 +35701,8 @@
           <w:sz w:val="22"/>
           <w:szCs w:val="22"/>
         </w:rPr>
-        <w:t>. 2011;75(3):354-360. doi:10.1111/j.1365-2265.</w:t>
-      </w:r>
-      <w:proofErr w:type="gramStart"/>
-      <w:r>
-        <w:rPr>
-          <w:sz w:val="22"/>
-          <w:szCs w:val="22"/>
-        </w:rPr>
-        <w:t>2011.04055.x</w:t>
-      </w:r>
-      <w:proofErr w:type="gramEnd"/>
+        <w:t>. 2011;75(3):354-360. doi:10.1111/j.1365-2265.2011.04055.x</w:t>
+      </w:r>
     </w:p>
     <w:p>
       <w:pPr>
@@ -35762,23 +35741,7 @@
           <w:sz w:val="22"/>
           <w:szCs w:val="22"/>
         </w:rPr>
-        <w:t>. 2002;970(1):112-118. doi:10.1111/j.1749-</w:t>
-      </w:r>
-      <w:proofErr w:type="gramStart"/>
-      <w:r>
-        <w:rPr>
-          <w:sz w:val="22"/>
-          <w:szCs w:val="22"/>
-        </w:rPr>
-        <w:t>6632.2002.tb</w:t>
-      </w:r>
-      <w:proofErr w:type="gramEnd"/>
-      <w:r>
-        <w:rPr>
-          <w:sz w:val="22"/>
-          <w:szCs w:val="22"/>
-        </w:rPr>
-        <w:t>04417.x</w:t>
+        <w:t>. 2002;970(1):112-118. doi:10.1111/j.1749-6632.2002.tb04417.x</w:t>
       </w:r>
     </w:p>
     <w:p>
@@ -35858,39 +35821,7 @@
           <w:sz w:val="22"/>
           <w:szCs w:val="22"/>
         </w:rPr>
-        <w:t xml:space="preserve">. </w:t>
-      </w:r>
-      <w:proofErr w:type="gramStart"/>
-      <w:r>
-        <w:rPr>
-          <w:sz w:val="22"/>
-          <w:szCs w:val="22"/>
-        </w:rPr>
-        <w:t>2011;42:1</w:t>
-      </w:r>
-      <w:proofErr w:type="gramEnd"/>
-      <w:r>
-        <w:rPr>
-          <w:sz w:val="22"/>
-          <w:szCs w:val="22"/>
-        </w:rPr>
-        <w:t>-28. doi:10.18637/</w:t>
-      </w:r>
-      <w:proofErr w:type="gramStart"/>
-      <w:r>
-        <w:rPr>
-          <w:sz w:val="22"/>
-          <w:szCs w:val="22"/>
-        </w:rPr>
-        <w:t>jss.v042.i</w:t>
-      </w:r>
-      <w:proofErr w:type="gramEnd"/>
-      <w:r>
-        <w:rPr>
-          <w:sz w:val="22"/>
-          <w:szCs w:val="22"/>
-        </w:rPr>
-        <w:t>08</w:t>
+        <w:t>. 2011;42:1-28. doi:10.18637/jss.v042.i08</w:t>
       </w:r>
     </w:p>
     <w:p>
@@ -35978,23 +35909,7 @@
           <w:szCs w:val="22"/>
         </w:rPr>
         <w:tab/>
-        <w:t xml:space="preserve">Broder MS, Neary MP, Chang E, Cherepanov D, Ludlam WH. Incidence of Cushing’s syndrome and Cushing’s disease in </w:t>
-      </w:r>
-      <w:proofErr w:type="gramStart"/>
-      <w:r>
-        <w:rPr>
-          <w:sz w:val="22"/>
-          <w:szCs w:val="22"/>
-        </w:rPr>
-        <w:t>commercially-insured</w:t>
-      </w:r>
-      <w:proofErr w:type="gramEnd"/>
-      <w:r>
-        <w:rPr>
-          <w:sz w:val="22"/>
-          <w:szCs w:val="22"/>
-        </w:rPr>
-        <w:t xml:space="preserve"> patients &lt;65 years old in the United States. </w:t>
+        <w:t xml:space="preserve">Broder MS, Neary MP, Chang E, Cherepanov D, Ludlam WH. Incidence of Cushing’s syndrome and Cushing’s disease in commercially-insured patients &lt;65 years old in the United States. </w:t>
       </w:r>
       <w:r>
         <w:rPr>
@@ -36051,23 +35966,7 @@
           <w:sz w:val="22"/>
           <w:szCs w:val="22"/>
         </w:rPr>
-        <w:t>. 1994;40(4):479-484. doi:10.1111/j.1365-</w:t>
-      </w:r>
-      <w:proofErr w:type="gramStart"/>
-      <w:r>
-        <w:rPr>
-          <w:sz w:val="22"/>
-          <w:szCs w:val="22"/>
-        </w:rPr>
-        <w:t>2265.1994.tb</w:t>
-      </w:r>
-      <w:proofErr w:type="gramEnd"/>
-      <w:r>
-        <w:rPr>
-          <w:sz w:val="22"/>
-          <w:szCs w:val="22"/>
-        </w:rPr>
-        <w:t>02486.x</w:t>
+        <w:t>. 1994;40(4):479-484. doi:10.1111/j.1365-2265.1994.tb02486.x</w:t>
       </w:r>
     </w:p>
     <w:p>
@@ -36187,23 +36086,7 @@
           <w:sz w:val="22"/>
           <w:szCs w:val="22"/>
         </w:rPr>
-        <w:t>. 2022;6(1</w:t>
-      </w:r>
-      <w:proofErr w:type="gramStart"/>
-      <w:r>
-        <w:rPr>
-          <w:sz w:val="22"/>
-          <w:szCs w:val="22"/>
-        </w:rPr>
-        <w:t>):bvab</w:t>
-      </w:r>
-      <w:proofErr w:type="gramEnd"/>
-      <w:r>
-        <w:rPr>
-          <w:sz w:val="22"/>
-          <w:szCs w:val="22"/>
-        </w:rPr>
-        <w:t>176. doi:10.1210/jendso/bvab176</w:t>
+        <w:t>. 2022;6(1):bvab176. doi:10.1210/jendso/bvab176</w:t>
       </w:r>
     </w:p>
     <w:p>
@@ -36243,23 +36126,7 @@
           <w:sz w:val="22"/>
           <w:szCs w:val="22"/>
         </w:rPr>
-        <w:t>. 2024;8(Supplement_1</w:t>
-      </w:r>
-      <w:proofErr w:type="gramStart"/>
-      <w:r>
-        <w:rPr>
-          <w:sz w:val="22"/>
-          <w:szCs w:val="22"/>
-        </w:rPr>
-        <w:t>):bvae</w:t>
-      </w:r>
-      <w:proofErr w:type="gramEnd"/>
-      <w:r>
-        <w:rPr>
-          <w:sz w:val="22"/>
-          <w:szCs w:val="22"/>
-        </w:rPr>
-        <w:t>163.2408. doi:10.1210/jendso/bvae163.2408</w:t>
+        <w:t>. 2024;8(Supplement_1):bvae163.2408. doi:10.1210/jendso/bvae163.2408</w:t>
       </w:r>
     </w:p>
     <w:p>
@@ -36403,15 +36270,7 @@
           <w:szCs w:val="22"/>
         </w:rPr>
         <w:tab/>
-        <w:t>Isidori AM, Graziadio C, Paragliola RM, et al. The hypertension of Cushing’s syndrome: controversies in..</w:t>
-      </w:r>
-      <w:proofErr w:type="gramStart"/>
-      <w:r>
-        <w:rPr>
-          <w:sz w:val="22"/>
-          <w:szCs w:val="22"/>
-        </w:rPr>
-        <w:t>.</w:t>
+        <w:t>Isidori AM, Graziadio C, Paragliola RM, et al. The hypertension of Cushing’s syndrome: controversies in...</w:t>
       </w:r>
       <w:r>
         <w:rPr>
@@ -36426,15 +36285,7 @@
           <w:sz w:val="22"/>
           <w:szCs w:val="22"/>
         </w:rPr>
-        <w:t>:</w:t>
-      </w:r>
-      <w:proofErr w:type="gramEnd"/>
-      <w:r>
-        <w:rPr>
-          <w:sz w:val="22"/>
-          <w:szCs w:val="22"/>
-        </w:rPr>
-        <w:t xml:space="preserve"> Journal of Hypertension. </w:t>
+        <w:t xml:space="preserve">: Journal of Hypertension. </w:t>
       </w:r>
       <w:r>
         <w:rPr>
@@ -36490,23 +36341,7 @@
           <w:sz w:val="22"/>
           <w:szCs w:val="22"/>
         </w:rPr>
-        <w:t xml:space="preserve">. 2006;20(3):467-482. </w:t>
-      </w:r>
-      <w:proofErr w:type="gramStart"/>
-      <w:r>
-        <w:rPr>
-          <w:sz w:val="22"/>
-          <w:szCs w:val="22"/>
-        </w:rPr>
-        <w:t>doi:10.1016/j.beem</w:t>
-      </w:r>
-      <w:proofErr w:type="gramEnd"/>
-      <w:r>
-        <w:rPr>
-          <w:sz w:val="22"/>
-          <w:szCs w:val="22"/>
-        </w:rPr>
-        <w:t>.2006.07.006</w:t>
+        <w:t>. 2006;20(3):467-482. doi:10.1016/j.beem.2006.07.006</w:t>
       </w:r>
     </w:p>
     <w:p>
@@ -36546,23 +36381,7 @@
           <w:sz w:val="22"/>
           <w:szCs w:val="22"/>
         </w:rPr>
-        <w:t>. 2024;17(1</w:t>
-      </w:r>
-      <w:proofErr w:type="gramStart"/>
-      <w:r>
-        <w:rPr>
-          <w:sz w:val="22"/>
-          <w:szCs w:val="22"/>
-        </w:rPr>
-        <w:t>):sfad</w:t>
-      </w:r>
-      <w:proofErr w:type="gramEnd"/>
-      <w:r>
-        <w:rPr>
-          <w:sz w:val="22"/>
-          <w:szCs w:val="22"/>
-        </w:rPr>
-        <w:t>282. doi:10.1093/ckj/sfad282</w:t>
+        <w:t>. 2024;17(1):sfad282. doi:10.1093/ckj/sfad282</w:t>
       </w:r>
     </w:p>
     <w:p>
@@ -36590,7 +36409,7 @@
       </w:r>
     </w:p>
     <w:sectPr>
-      <w:headerReference w:type="default" r:id="rId11"/>
+      <w:headerReference w:type="default" r:id="rId13"/>
       <w:pgSz w:w="12240" w:h="15840"/>
       <w:pgMar w:top="1440" w:right="1440" w:bottom="1440" w:left="1440" w:header="720" w:footer="720" w:gutter="0"/>
       <w:cols w:space="720"/>
@@ -39129,6 +38948,7 @@
   <w:style w:type="character" w:default="1" w:styleId="DefaultParagraphFont">
     <w:name w:val="Default Paragraph Font"/>
     <w:uiPriority w:val="1"/>
+    <w:semiHidden/>
     <w:unhideWhenUsed/>
   </w:style>
   <w:style w:type="table" w:default="1" w:styleId="TableNormal">

</xml_diff>

<commit_message>
Made minor changes to table layouts
</commit_message>
<xml_diff>
--- a/manuscript/Cushings-Obesity/manuscript-medrxiv.docx
+++ b/manuscript/Cushings-Obesity/manuscript-medrxiv.docx
@@ -57,6 +57,12 @@
           <w:vertAlign w:val="superscript"/>
         </w:rPr>
         <w:t>2</w:t>
+      </w:r>
+      <w:r>
+        <w:rPr>
+          <w:vertAlign w:val="superscript"/>
+        </w:rPr>
+        <w:t>,3</w:t>
       </w:r>
       <w:r>
         <w:t>, and Dave Bridges</w:t>
@@ -2794,16 +2800,16 @@
         <mc:AlternateContent>
           <mc:Choice Requires="wps">
             <w:drawing>
-              <wp:anchor distT="0" distB="0" distL="114300" distR="114300" simplePos="0" relativeHeight="251661312" behindDoc="0" locked="0" layoutInCell="1" allowOverlap="1" wp14:anchorId="0497E870" wp14:editId="05520DDE">
+              <wp:anchor distT="0" distB="0" distL="114300" distR="114300" simplePos="0" relativeHeight="251661312" behindDoc="0" locked="0" layoutInCell="1" allowOverlap="1" wp14:anchorId="0497E870" wp14:editId="4CA5775F">
                 <wp:simplePos x="0" y="0"/>
                 <wp:positionH relativeFrom="column">
-                  <wp:posOffset>-65405</wp:posOffset>
+                  <wp:posOffset>-64770</wp:posOffset>
                 </wp:positionH>
                 <wp:positionV relativeFrom="paragraph">
-                  <wp:posOffset>38929</wp:posOffset>
+                  <wp:posOffset>38735</wp:posOffset>
                 </wp:positionV>
-                <wp:extent cx="3890645" cy="3694430"/>
-                <wp:effectExtent l="0" t="0" r="0" b="1270"/>
+                <wp:extent cx="3890645" cy="3749040"/>
+                <wp:effectExtent l="0" t="0" r="0" b="0"/>
                 <wp:wrapSquare wrapText="bothSides"/>
                 <wp:docPr id="1799177725" name="Text Box 1"/>
                 <wp:cNvGraphicFramePr/>
@@ -2814,7 +2820,7 @@
                       <wps:spPr>
                         <a:xfrm>
                           <a:off x="0" y="0"/>
-                          <a:ext cx="3890645" cy="3694430"/>
+                          <a:ext cx="3890645" cy="3749040"/>
                         </a:xfrm>
                         <a:prstGeom prst="rect">
                           <a:avLst/>
@@ -4059,7 +4065,7 @@
                 <v:stroke joinstyle="miter"/>
                 <v:path gradientshapeok="t" o:connecttype="rect"/>
               </v:shapetype>
-              <v:shape id="_x0000_s1027" type="#_x0000_t202" style="position:absolute;margin-left:-5.15pt;margin-top:3.05pt;width:306.35pt;height:290.9pt;z-index:251661312;visibility:visible;mso-wrap-style:square;mso-width-percent:0;mso-height-percent:0;mso-wrap-distance-left:9pt;mso-wrap-distance-top:0;mso-wrap-distance-right:9pt;mso-wrap-distance-bottom:0;mso-position-horizontal:absolute;mso-position-horizontal-relative:text;mso-position-vertical:absolute;mso-position-vertical-relative:text;mso-width-percent:0;mso-height-percent:0;mso-width-relative:margin;mso-height-relative:margin;v-text-anchor:top" o:gfxdata="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" fillcolor="white [3201]" stroked="f" strokeweight=".5pt">
+              <v:shape id="_x0000_s1027" type="#_x0000_t202" style="position:absolute;margin-left:-5.1pt;margin-top:3.05pt;width:306.35pt;height:295.2pt;z-index:251661312;visibility:visible;mso-wrap-style:square;mso-width-percent:0;mso-height-percent:0;mso-wrap-distance-left:9pt;mso-wrap-distance-top:0;mso-wrap-distance-right:9pt;mso-wrap-distance-bottom:0;mso-position-horizontal:absolute;mso-position-horizontal-relative:text;mso-position-vertical:absolute;mso-position-vertical-relative:text;mso-width-percent:0;mso-height-percent:0;mso-width-relative:margin;mso-height-relative:margin;v-text-anchor:top" o:gfxdata="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" fillcolor="white [3201]" stroked="f" strokeweight=".5pt">
                 <v:textbox>
                   <w:txbxContent>
                     <w:p>
@@ -6239,7 +6245,7 @@
         <mc:AlternateContent>
           <mc:Choice Requires="wps">
             <w:drawing>
-              <wp:anchor distT="0" distB="0" distL="114300" distR="114300" simplePos="0" relativeHeight="251663360" behindDoc="0" locked="0" layoutInCell="1" allowOverlap="1" wp14:anchorId="36598664" wp14:editId="77BD4AF7">
+              <wp:anchor distT="0" distB="0" distL="114300" distR="114300" simplePos="0" relativeHeight="251663360" behindDoc="0" locked="0" layoutInCell="1" allowOverlap="1" wp14:anchorId="36598664" wp14:editId="1DD6D3E4">
                 <wp:simplePos x="0" y="0"/>
                 <wp:positionH relativeFrom="column">
                   <wp:posOffset>36830</wp:posOffset>
@@ -6247,8 +6253,8 @@
                 <wp:positionV relativeFrom="paragraph">
                   <wp:posOffset>0</wp:posOffset>
                 </wp:positionV>
-                <wp:extent cx="6269990" cy="3479800"/>
-                <wp:effectExtent l="0" t="0" r="3810" b="0"/>
+                <wp:extent cx="6269990" cy="3564255"/>
+                <wp:effectExtent l="0" t="0" r="3810" b="4445"/>
                 <wp:wrapSquare wrapText="bothSides"/>
                 <wp:docPr id="1974602515" name="Text Box 1"/>
                 <wp:cNvGraphicFramePr/>
@@ -6259,7 +6265,7 @@
                       <wps:spPr>
                         <a:xfrm>
                           <a:off x="0" y="0"/>
-                          <a:ext cx="6269990" cy="3479800"/>
+                          <a:ext cx="6269990" cy="3564255"/>
                         </a:xfrm>
                         <a:prstGeom prst="rect">
                           <a:avLst/>
@@ -8164,7 +8170,7 @@
           </mc:Choice>
           <mc:Fallback>
             <w:pict>
-              <v:shape w14:anchorId="36598664" id="_x0000_s1028" type="#_x0000_t202" style="position:absolute;margin-left:2.9pt;margin-top:0;width:493.7pt;height:274pt;z-index:251663360;visibility:visible;mso-wrap-style:square;mso-width-percent:0;mso-height-percent:0;mso-wrap-distance-left:9pt;mso-wrap-distance-top:0;mso-wrap-distance-right:9pt;mso-wrap-distance-bottom:0;mso-position-horizontal:absolute;mso-position-horizontal-relative:text;mso-position-vertical:absolute;mso-position-vertical-relative:text;mso-width-percent:0;mso-height-percent:0;mso-width-relative:margin;mso-height-relative:margin;v-text-anchor:top" o:gfxdata="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" fillcolor="white [3201]" stroked="f" strokeweight=".5pt">
+              <v:shape w14:anchorId="36598664" id="_x0000_s1028" type="#_x0000_t202" style="position:absolute;margin-left:2.9pt;margin-top:0;width:493.7pt;height:280.65pt;z-index:251663360;visibility:visible;mso-wrap-style:square;mso-width-percent:0;mso-height-percent:0;mso-wrap-distance-left:9pt;mso-wrap-distance-top:0;mso-wrap-distance-right:9pt;mso-wrap-distance-bottom:0;mso-position-horizontal:absolute;mso-position-horizontal-relative:text;mso-position-vertical:absolute;mso-position-vertical-relative:text;mso-width-percent:0;mso-height-percent:0;mso-width-relative:margin;mso-height-relative:margin;v-text-anchor:top" o:gfxdata="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" fillcolor="white [3201]" stroked="f" strokeweight=".5pt">
                 <v:textbox>
                   <w:txbxContent>
                     <w:p>
@@ -11557,16 +11563,16 @@
         <mc:AlternateContent>
           <mc:Choice Requires="wps">
             <w:drawing>
-              <wp:anchor distT="0" distB="0" distL="114300" distR="114300" simplePos="0" relativeHeight="251667456" behindDoc="0" locked="0" layoutInCell="1" allowOverlap="1" wp14:anchorId="015025C4" wp14:editId="0459B6E9">
+              <wp:anchor distT="0" distB="0" distL="114300" distR="114300" simplePos="0" relativeHeight="251667456" behindDoc="0" locked="0" layoutInCell="1" allowOverlap="1" wp14:anchorId="015025C4" wp14:editId="722B026F">
                 <wp:simplePos x="0" y="0"/>
                 <wp:positionH relativeFrom="column">
-                  <wp:posOffset>-914400</wp:posOffset>
+                  <wp:posOffset>-701675</wp:posOffset>
                 </wp:positionH>
                 <wp:positionV relativeFrom="paragraph">
-                  <wp:posOffset>0</wp:posOffset>
+                  <wp:posOffset>231</wp:posOffset>
                 </wp:positionV>
-                <wp:extent cx="7958455" cy="8369300"/>
-                <wp:effectExtent l="0" t="0" r="4445" b="0"/>
+                <wp:extent cx="7357630" cy="8369300"/>
+                <wp:effectExtent l="0" t="0" r="0" b="0"/>
                 <wp:wrapSquare wrapText="bothSides"/>
                 <wp:docPr id="520476556" name="Text Box 1"/>
                 <wp:cNvGraphicFramePr/>
@@ -11577,7 +11583,7 @@
                       <wps:spPr>
                         <a:xfrm>
                           <a:off x="0" y="0"/>
-                          <a:ext cx="7958455" cy="8369300"/>
+                          <a:ext cx="7357630" cy="8369300"/>
                         </a:xfrm>
                         <a:prstGeom prst="rect">
                           <a:avLst/>
@@ -16098,7 +16104,7 @@
           </mc:Choice>
           <mc:Fallback>
             <w:pict>
-              <v:shape w14:anchorId="015025C4" id="_x0000_s1030" type="#_x0000_t202" style="position:absolute;margin-left:-1in;margin-top:0;width:626.65pt;height:659pt;z-index:251667456;visibility:visible;mso-wrap-style:square;mso-width-percent:0;mso-height-percent:0;mso-wrap-distance-left:9pt;mso-wrap-distance-top:0;mso-wrap-distance-right:9pt;mso-wrap-distance-bottom:0;mso-position-horizontal:absolute;mso-position-horizontal-relative:text;mso-position-vertical:absolute;mso-position-vertical-relative:text;mso-width-percent:0;mso-height-percent:0;mso-width-relative:margin;mso-height-relative:margin;v-text-anchor:top" o:gfxdata="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" fillcolor="white [3201]" stroked="f" strokeweight=".5pt">
+              <v:shape w14:anchorId="015025C4" id="_x0000_s1030" type="#_x0000_t202" style="position:absolute;margin-left:-55.25pt;margin-top:0;width:579.35pt;height:659pt;z-index:251667456;visibility:visible;mso-wrap-style:square;mso-width-percent:0;mso-height-percent:0;mso-wrap-distance-left:9pt;mso-wrap-distance-top:0;mso-wrap-distance-right:9pt;mso-wrap-distance-bottom:0;mso-position-horizontal:absolute;mso-position-horizontal-relative:text;mso-position-vertical:absolute;mso-position-vertical-relative:text;mso-width-percent:0;mso-height-percent:0;mso-width-relative:margin;mso-height-relative:margin;v-text-anchor:top" o:gfxdata="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" fillcolor="white [3201]" stroked="f" strokeweight=".5pt">
                 <v:textbox>
                   <w:txbxContent>
                     <w:p>
@@ -34087,15 +34093,13 @@
         </w:rPr>
         <w:t>function, but</w:t>
       </w:r>
-      <w:ins w:id="0" w:author="Dave Bridges" w:date="2026-01-22T09:39:00Z" w16du:dateUtc="2026-01-22T14:39:00Z">
-        <w:r>
-          <w:rPr>
-            <w:sz w:val="22"/>
-            <w:szCs w:val="22"/>
-          </w:rPr>
-          <w:t xml:space="preserve"> </w:t>
-        </w:r>
-      </w:ins>
+      <w:r>
+        <w:rPr>
+          <w:sz w:val="22"/>
+          <w:szCs w:val="22"/>
+        </w:rPr>
+        <w:t xml:space="preserve"> </w:t>
+      </w:r>
       <w:r>
         <w:rPr>
           <w:sz w:val="22"/>
@@ -34439,21 +34443,12 @@
         </w:rPr>
         <w:t>are more likely to be obese</w:t>
       </w:r>
-      <w:ins w:id="1" w:author="Irit Hochberg" w:date="2026-01-22T09:36:00Z" w16du:dateUtc="2026-01-22T14:36:00Z">
-        <w:r>
-          <w:rPr>
-            <w:sz w:val="22"/>
-            <w:szCs w:val="22"/>
-          </w:rPr>
-          <w:t>.</w:t>
-        </w:r>
-      </w:ins>
-      <w:r>
-        <w:rPr>
-          <w:sz w:val="22"/>
-          <w:szCs w:val="22"/>
-        </w:rPr>
-        <w:t xml:space="preserve">  Women in this group, on average, tend to have worsened and more heterogeneous responses to these dual co-morbidities than males</w:t>
+      <w:r>
+        <w:rPr>
+          <w:sz w:val="22"/>
+          <w:szCs w:val="22"/>
+        </w:rPr>
+        <w:t>.  Women in this group, on average, tend to have worsened and more heterogeneous responses to these dual co-morbidities than males</w:t>
       </w:r>
       <w:r>
         <w:rPr>
@@ -38340,14 +38335,6 @@
 </w:numbering>
 </file>
 
-<file path=word/people.xml><?xml version="1.0" encoding="utf-8"?>
-<w15:people xmlns:wpc="http://schemas.microsoft.com/office/word/2010/wordprocessingCanvas" xmlns:cx="http://schemas.microsoft.com/office/drawing/2014/chartex" xmlns:cx1="http://schemas.microsoft.com/office/drawing/2015/9/8/chartex" xmlns:cx2="http://schemas.microsoft.com/office/drawing/2015/10/21/chartex" xmlns:cx3="http://schemas.microsoft.com/office/drawing/2016/5/9/chartex" xmlns:cx4="http://schemas.microsoft.com/office/drawing/2016/5/10/chartex" xmlns:cx5="http://schemas.microsoft.com/office/drawing/2016/5/11/chartex" xmlns:cx6="http://schemas.microsoft.com/office/drawing/2016/5/12/chartex" xmlns:cx7="http://schemas.microsoft.com/office/drawing/2016/5/13/chartex" xmlns:cx8="http://schemas.microsoft.com/office/drawing/2016/5/14/chartex" xmlns:mc="http://schemas.openxmlformats.org/markup-compatibility/2006" xmlns:aink="http://schemas.microsoft.com/office/drawing/2016/ink" xmlns:am3d="http://schemas.microsoft.com/office/drawing/2017/model3d" xmlns:o="urn:schemas-microsoft-com:office:office" xmlns:oel="http://schemas.microsoft.com/office/2019/extlst" xmlns:r="http://schemas.openxmlformats.org/officeDocument/2006/relationships" xmlns:m="http://schemas.openxmlformats.org/officeDocument/2006/math" xmlns:v="urn:schemas-microsoft-com:vml" xmlns:wp14="http://schemas.microsoft.com/office/word/2010/wordprocessingDrawing" xmlns:wp="http://schemas.openxmlformats.org/drawingml/2006/wordprocessingDrawing" xmlns:w10="urn:schemas-microsoft-com:office:word" xmlns:w="http://schemas.openxmlformats.org/wordprocessingml/2006/main" xmlns:w14="http://schemas.microsoft.com/office/word/2010/wordml" xmlns:w15="http://schemas.microsoft.com/office/word/2012/wordml" xmlns:w16cex="http://schemas.microsoft.com/office/word/2018/wordml/cex" xmlns:w16cid="http://schemas.microsoft.com/office/word/2016/wordml/cid" xmlns:w16="http://schemas.microsoft.com/office/word/2018/wordml" xmlns:w16du="http://schemas.microsoft.com/office/word/2023/wordml/word16du" xmlns:w16sdtdh="http://schemas.microsoft.com/office/word/2020/wordml/sdtdatahash" xmlns:w16sdtfl="http://schemas.microsoft.com/office/word/2024/wordml/sdtformatlock" xmlns:w16se="http://schemas.microsoft.com/office/word/2015/wordml/symex" xmlns:wpg="http://schemas.microsoft.com/office/word/2010/wordprocessingGroup" xmlns:wpi="http://schemas.microsoft.com/office/word/2010/wordprocessingInk" xmlns:wne="http://schemas.microsoft.com/office/word/2006/wordml" xmlns:wps="http://schemas.microsoft.com/office/word/2010/wordprocessingShape" mc:Ignorable="w14 w15 w16se w16cid w16 w16cex w16sdtdh w16sdtfl w16du wp14">
-  <w15:person w15:author="Dave Bridges">
-    <w15:presenceInfo w15:providerId="None" w15:userId="Dave Bridges"/>
-  </w15:person>
-</w15:people>
-</file>
-
 <file path=word/styles.xml><?xml version="1.0" encoding="utf-8"?>
 <w:styles xmlns:mc="http://schemas.openxmlformats.org/markup-compatibility/2006" xmlns:r="http://schemas.openxmlformats.org/officeDocument/2006/relationships" xmlns:w="http://schemas.openxmlformats.org/wordprocessingml/2006/main" xmlns:w14="http://schemas.microsoft.com/office/word/2010/wordml" xmlns:w15="http://schemas.microsoft.com/office/word/2012/wordml" xmlns:w16cex="http://schemas.microsoft.com/office/word/2018/wordml/cex" xmlns:w16cid="http://schemas.microsoft.com/office/word/2016/wordml/cid" xmlns:w16="http://schemas.microsoft.com/office/word/2018/wordml" xmlns:w16du="http://schemas.microsoft.com/office/word/2023/wordml/word16du" xmlns:w16sdtdh="http://schemas.microsoft.com/office/word/2020/wordml/sdtdatahash" xmlns:w16sdtfl="http://schemas.microsoft.com/office/word/2024/wordml/sdtformatlock" xmlns:w16se="http://schemas.microsoft.com/office/word/2015/wordml/symex" mc:Ignorable="w14 w15 w16se w16cid w16 w16cex w16sdtdh w16sdtfl w16du">
   <w:docDefaults>

</xml_diff>

<commit_message>
Added the updated table 4 with the corrected splines modelling and added information to methods, figure legends, results and discussion.  Part of issue #75
</commit_message>
<xml_diff>
--- a/manuscript/Cushings-Obesity/manuscript-medrxiv.docx
+++ b/manuscript/Cushings-Obesity/manuscript-medrxiv.docx
@@ -2121,6 +2121,80 @@
         </w:rPr>
         <w:t xml:space="preserve"> </w:t>
       </w:r>
+      <w:r>
+        <w:rPr>
+          <w:sz w:val="22"/>
+          <w:szCs w:val="22"/>
+        </w:rPr>
+        <w:t xml:space="preserve"> </w:t>
+      </w:r>
+      <w:r>
+        <w:rPr>
+          <w:sz w:val="22"/>
+          <w:szCs w:val="22"/>
+        </w:rPr>
+        <w:t xml:space="preserve">For sensitivity analyses treating BMI as a continuous variable (linear or restricted cubic spline with 4 degrees of freedom), the Cushing's × BMI interaction was </w:t>
+      </w:r>
+      <w:proofErr w:type="spellStart"/>
+      <w:r>
+        <w:rPr>
+          <w:sz w:val="22"/>
+          <w:szCs w:val="22"/>
+        </w:rPr>
+        <w:t>summarised</w:t>
+      </w:r>
+      <w:proofErr w:type="spellEnd"/>
+      <w:r>
+        <w:rPr>
+          <w:sz w:val="22"/>
+          <w:szCs w:val="22"/>
+        </w:rPr>
+        <w:t xml:space="preserve"> on the obese-minus-lean shift scale by contrasting model-predicted outcomes at the mean BMI of participants with BMI ≥30 kg/m² versus the mean BMI of participants with BMI &lt;30 kg/m², using the </w:t>
+      </w:r>
+      <w:proofErr w:type="spellStart"/>
+      <w:r>
+        <w:rPr>
+          <w:sz w:val="22"/>
+          <w:szCs w:val="22"/>
+        </w:rPr>
+        <w:t>emmeans</w:t>
+      </w:r>
+      <w:proofErr w:type="spellEnd"/>
+      <w:r>
+        <w:rPr>
+          <w:sz w:val="22"/>
+          <w:szCs w:val="22"/>
+        </w:rPr>
+        <w:t xml:space="preserve"> package. This yields an interaction estimate with the same sign convention and units as the primary dichotomous BMI ≥30 indicator, </w:t>
+      </w:r>
+      <w:r>
+        <w:rPr>
+          <w:sz w:val="22"/>
+          <w:szCs w:val="22"/>
+        </w:rPr>
+        <w:t>allowing</w:t>
+      </w:r>
+      <w:r>
+        <w:rPr>
+          <w:sz w:val="22"/>
+          <w:szCs w:val="22"/>
+        </w:rPr>
+        <w:t xml:space="preserve"> </w:t>
+      </w:r>
+      <w:r>
+        <w:rPr>
+          <w:sz w:val="22"/>
+          <w:szCs w:val="22"/>
+        </w:rPr>
+        <w:t>comparison</w:t>
+      </w:r>
+      <w:r>
+        <w:rPr>
+          <w:sz w:val="22"/>
+          <w:szCs w:val="22"/>
+        </w:rPr>
+        <w:t xml:space="preserve"> across rows of Table 4.</w:t>
+      </w:r>
     </w:p>
     <w:p>
       <w:pPr>
@@ -2130,6 +2204,7 @@
         <w:rPr>
           <w:noProof/>
         </w:rPr>
+        <w:lastRenderedPageBreak/>
         <mc:AlternateContent>
           <mc:Choice Requires="wps">
             <w:drawing>
@@ -2311,7 +2386,7 @@
                                     <pic:cNvPicPr/>
                                   </pic:nvPicPr>
                                   <pic:blipFill>
-                                    <a:blip r:embed="rId9">
+                                    <a:blip r:embed="rId8">
                                       <a:extLst>
                                         <a:ext uri="{28A0092B-C50C-407E-A947-70E740481C1C}">
                                           <a14:useLocalDpi xmlns:a14="http://schemas.microsoft.com/office/drawing/2010/main" val="0"/>
@@ -2605,15 +2680,7 @@
           <w:sz w:val="22"/>
           <w:szCs w:val="22"/>
         </w:rPr>
-        <w:t xml:space="preserve">The average age at diagnosis was 46.3 +/- 15.5 years. There were 287 female and 72 male patients.   The average BMI was 34.72 (+/- 13.78). The patient population was predominately White (87.19%), with the remaining participants identifying as Black (5.29%), </w:t>
-      </w:r>
-      <w:r>
-        <w:rPr>
-          <w:sz w:val="22"/>
-          <w:szCs w:val="22"/>
-        </w:rPr>
-        <w:lastRenderedPageBreak/>
-        <w:t xml:space="preserve">Hispanic or Latino (2.79%), Asian (2.23%), or Other (2.51%). </w:t>
+        <w:t xml:space="preserve">The average age at diagnosis was 46.3 +/- 15.5 years. There were 287 female and 72 male patients.   The average BMI was 34.72 (+/- 13.78). The patient population was predominately White (87.19%), with the remaining participants identifying as Black (5.29%), Hispanic or Latino (2.79%), Asian (2.23%), or Other (2.51%). </w:t>
       </w:r>
       <w:r>
         <w:rPr>
@@ -2797,6 +2864,7 @@
         <w:rPr>
           <w:noProof/>
         </w:rPr>
+        <w:lastRenderedPageBreak/>
         <mc:AlternateContent>
           <mc:Choice Requires="wps">
             <w:drawing>
@@ -4061,11 +4129,7 @@
           </mc:Choice>
           <mc:Fallback>
             <w:pict>
-              <v:shapetype w14:anchorId="0497E870" id="_x0000_t202" coordsize="21600,21600" o:spt="202" path="m,l,21600r21600,l21600,xe">
-                <v:stroke joinstyle="miter"/>
-                <v:path gradientshapeok="t" o:connecttype="rect"/>
-              </v:shapetype>
-              <v:shape id="_x0000_s1027" type="#_x0000_t202" style="position:absolute;margin-left:-5.1pt;margin-top:3.05pt;width:306.35pt;height:295.2pt;z-index:251661312;visibility:visible;mso-wrap-style:square;mso-width-percent:0;mso-height-percent:0;mso-wrap-distance-left:9pt;mso-wrap-distance-top:0;mso-wrap-distance-right:9pt;mso-wrap-distance-bottom:0;mso-position-horizontal:absolute;mso-position-horizontal-relative:text;mso-position-vertical:absolute;mso-position-vertical-relative:text;mso-width-percent:0;mso-height-percent:0;mso-width-relative:margin;mso-height-relative:margin;v-text-anchor:top" o:gfxdata="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" fillcolor="white [3201]" stroked="f" strokeweight=".5pt">
+              <v:shape w14:anchorId="0497E870" id="_x0000_s1027" type="#_x0000_t202" style="position:absolute;margin-left:-5.1pt;margin-top:3.05pt;width:306.35pt;height:295.2pt;z-index:251661312;visibility:visible;mso-wrap-style:square;mso-width-percent:0;mso-height-percent:0;mso-wrap-distance-left:9pt;mso-wrap-distance-top:0;mso-wrap-distance-right:9pt;mso-wrap-distance-bottom:0;mso-position-horizontal:absolute;mso-position-horizontal-relative:text;mso-position-vertical:absolute;mso-position-vertical-relative:text;mso-width-percent:0;mso-height-percent:0;mso-width-relative:margin;mso-height-relative:margin;v-text-anchor:top" o:gfxdata="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" fillcolor="white [3201]" stroked="f" strokeweight=".5pt">
                 <v:textbox>
                   <w:txbxContent>
                     <w:p>
@@ -10533,7 +10597,7 @@
                                           <pic:cNvPicPr/>
                                         </pic:nvPicPr>
                                         <pic:blipFill>
-                                          <a:blip r:embed="rId10">
+                                          <a:blip r:embed="rId9">
                                             <a:extLst>
                                               <a:ext uri="{28A0092B-C50C-407E-A947-70E740481C1C}">
                                                 <a14:useLocalDpi xmlns:a14="http://schemas.microsoft.com/office/drawing/2010/main" val="0"/>
@@ -10691,7 +10755,7 @@
                                     <pic:cNvPicPr/>
                                   </pic:nvPicPr>
                                   <pic:blipFill>
-                                    <a:blip r:embed="rId11">
+                                    <a:blip r:embed="rId9">
                                       <a:extLst>
                                         <a:ext uri="{28A0092B-C50C-407E-A947-70E740481C1C}">
                                           <a14:useLocalDpi xmlns:a14="http://schemas.microsoft.com/office/drawing/2010/main" val="0"/>
@@ -20999,149 +21063,80 @@
           <w:sz w:val="22"/>
           <w:szCs w:val="22"/>
         </w:rPr>
-        <w:t>We performed a variety of sensitivity analyses to test the assumptions used in evaluating these effects, summarized in Table 4.</w:t>
-      </w:r>
-      <w:r>
-        <w:rPr>
-          <w:sz w:val="22"/>
-          <w:szCs w:val="22"/>
-        </w:rPr>
-        <w:t xml:space="preserve">  By and large, these analyses show that the effects described above are robust to different analytical methods.  For example, the synergistic effects of obesity and Cushing’s disease on liver enzymes was similar and significant across different demographic adjustments.  We also found that propensity matching cases for </w:t>
-      </w:r>
-      <w:r>
-        <w:rPr>
-          <w:sz w:val="22"/>
-          <w:szCs w:val="22"/>
-        </w:rPr>
-        <w:t>BMI or</w:t>
-      </w:r>
-      <w:r>
-        <w:rPr>
-          <w:sz w:val="22"/>
-          <w:szCs w:val="22"/>
-        </w:rPr>
-        <w:t xml:space="preserve"> including BMI as a covariate did not attenuate these effects.  Within subgroups, we did notice some suggestive trends.  For example, the synergistic (and antagonistic) effects of obesity </w:t>
-      </w:r>
-      <w:r>
-        <w:rPr>
-          <w:sz w:val="22"/>
-          <w:szCs w:val="22"/>
-        </w:rPr>
-        <w:t>were larger</w:t>
-      </w:r>
-      <w:r>
-        <w:rPr>
-          <w:sz w:val="22"/>
-          <w:szCs w:val="22"/>
-        </w:rPr>
-        <w:t xml:space="preserve"> as obesity increased.  For example, the interaction between Class I obesity and Cushing’s disease on ALT levels was -12.8 mg/dL but increased to </w:t>
-      </w:r>
-      <w:r>
-        <w:rPr>
-          <w:sz w:val="22"/>
-          <w:szCs w:val="22"/>
-        </w:rPr>
-        <w:t>+</w:t>
-      </w:r>
-      <w:r>
-        <w:rPr>
-          <w:sz w:val="22"/>
-          <w:szCs w:val="22"/>
-        </w:rPr>
-        <w:t>30.3 for Class II obesity and 80.7 for class III obesity.  Since this analysis already accounted for a main effect of obesity status, this suggest</w:t>
-      </w:r>
-      <w:r>
-        <w:rPr>
-          <w:sz w:val="22"/>
-          <w:szCs w:val="22"/>
-        </w:rPr>
-        <w:t>s</w:t>
-      </w:r>
-      <w:r>
-        <w:rPr>
-          <w:sz w:val="22"/>
-          <w:szCs w:val="22"/>
-        </w:rPr>
-        <w:t xml:space="preserve"> that as obesity increases, the negative effect of Cushing’s disease on liver enzymes increased, while the protective effect on blood pressure was also trended to increase in magnitude.  Stratifying by gender, we noticed that female patients generally had worse but more variable effect estimates.  In the case of AST, the</w:t>
-      </w:r>
-      <w:r>
-        <w:rPr>
-          <w:sz w:val="22"/>
-          <w:szCs w:val="22"/>
-        </w:rPr>
-        <w:t xml:space="preserve"> </w:t>
-      </w:r>
-      <w:r>
-        <w:rPr>
-          <w:sz w:val="22"/>
-          <w:szCs w:val="22"/>
-        </w:rPr>
-        <w:t xml:space="preserve">interaction between obesity and </w:t>
-      </w:r>
-      <w:r>
-        <w:rPr>
-          <w:sz w:val="22"/>
-          <w:szCs w:val="22"/>
-        </w:rPr>
-        <w:t>Cushing’s</w:t>
-      </w:r>
-      <w:r>
-        <w:rPr>
-          <w:sz w:val="22"/>
-          <w:szCs w:val="22"/>
-        </w:rPr>
-        <w:t xml:space="preserve"> </w:t>
-      </w:r>
-      <w:r>
-        <w:rPr>
-          <w:sz w:val="22"/>
-          <w:szCs w:val="22"/>
-        </w:rPr>
-        <w:t xml:space="preserve">disease </w:t>
-      </w:r>
-      <w:r>
-        <w:rPr>
-          <w:sz w:val="22"/>
-          <w:szCs w:val="22"/>
-        </w:rPr>
-        <w:t xml:space="preserve">was estimated at </w:t>
-      </w:r>
-      <w:r>
-        <w:rPr>
-          <w:sz w:val="22"/>
-          <w:szCs w:val="22"/>
-        </w:rPr>
-        <w:t xml:space="preserve">an increase of </w:t>
-      </w:r>
-      <w:r>
-        <w:rPr>
-          <w:sz w:val="22"/>
-          <w:szCs w:val="22"/>
-        </w:rPr>
-        <w:t xml:space="preserve">41.9 [-3.7-87.5] mg/dL </w:t>
-      </w:r>
-      <w:r>
-        <w:rPr>
-          <w:sz w:val="22"/>
-          <w:szCs w:val="22"/>
-        </w:rPr>
-        <w:t xml:space="preserve">beyond Cushing’s disease or obesity additively, </w:t>
-      </w:r>
-      <w:r>
-        <w:rPr>
-          <w:sz w:val="22"/>
-          <w:szCs w:val="22"/>
-        </w:rPr>
-        <w:t xml:space="preserve">but for males it was 25.8 [11.4-40.1] mg/dL.  </w:t>
-      </w:r>
-    </w:p>
-    <w:p>
-      <w:pPr>
-        <w:rPr>
-          <w:sz w:val="22"/>
-          <w:szCs w:val="22"/>
-        </w:rPr>
-      </w:pPr>
+        <w:t xml:space="preserve">We performed a variety of sensitivity analyses to test the assumptions used in evaluating these effects, </w:t>
+      </w:r>
+      <w:r>
+        <w:rPr>
+          <w:sz w:val="22"/>
+          <w:szCs w:val="22"/>
+        </w:rPr>
+        <w:t>summarized</w:t>
+      </w:r>
+      <w:r>
+        <w:rPr>
+          <w:sz w:val="22"/>
+          <w:szCs w:val="22"/>
+        </w:rPr>
+        <w:t xml:space="preserve"> in Table 4. By and large, these analyses show that the effects described above are robust to different analytical methods. The synergistic effects of obesity and Cushing's disease on liver enzymes were similar and significant across demographic-adjustment choices, and propensity matching cases for BMI or including BMI as a within-stratum covariate did not attenuate them. Modelling BMI continuously</w:t>
+      </w:r>
+      <w:r>
+        <w:rPr>
+          <w:sz w:val="22"/>
+          <w:szCs w:val="22"/>
+        </w:rPr>
+        <w:t xml:space="preserve">, </w:t>
+      </w:r>
+      <w:r>
+        <w:rPr>
+          <w:sz w:val="22"/>
+          <w:szCs w:val="22"/>
+        </w:rPr>
+        <w:t>either as a linear term or as a natural cubic spline</w:t>
+      </w:r>
+      <w:r>
+        <w:rPr>
+          <w:sz w:val="22"/>
+          <w:szCs w:val="22"/>
+        </w:rPr>
+        <w:t xml:space="preserve">, </w:t>
+      </w:r>
+      <w:r>
+        <w:rPr>
+          <w:sz w:val="22"/>
+          <w:szCs w:val="22"/>
+        </w:rPr>
+        <w:t>produced interaction estimates consistent with the primary dichotomous analysis for all outcomes except glucose and HbA1c. For glucose, the spline specification (the most flexible of the three) and the primary dichotomous model both showed no significant interaction; the linear specification produced a small significant negative estimate (−4.19 mg/dL [−7.11, −1.26]) that is not reproduced by the more flexible spline, consistent with sensitivity of a forced-linear specification to the differing BMI distributions between cases and controls. For the blood pressure outcomes, the spline specification produced larger attenuation estimates than the dichotomous model (</w:t>
+      </w:r>
+      <w:r>
+        <w:rPr>
+          <w:i/>
+          <w:iCs/>
+          <w:sz w:val="22"/>
+          <w:szCs w:val="22"/>
+        </w:rPr>
+        <w:t>e.g.,</w:t>
+      </w:r>
+      <w:r>
+        <w:rPr>
+          <w:sz w:val="22"/>
+          <w:szCs w:val="22"/>
+        </w:rPr>
+        <w:t xml:space="preserve"> SBP interaction −16.1 mm Hg [−22.8, −9.3] under the spline versus −8.9 mm Hg under the dichotomous model), indicating that the obesity-associated attenuation of Cushing's-related hypertension is not an artifact of the BMI ≥30 threshold. Within subgroups, the synergistic (and antagonistic) effects of obesity were larger as obesity class increased. For example, the Class I obesity × Cushing's disease interaction on ALT was −12.8 mg/dL, rising to +30.3 for Class II and +80.1 for Class III. Since this analysis already accounted for a main effect of obesity status, this suggests that as obesity increases, the negative effect of Cushing's disease on liver enzymes increases, while the protective effect on blood pressure also trends </w:t>
+      </w:r>
+      <w:r>
+        <w:rPr>
+          <w:sz w:val="22"/>
+          <w:szCs w:val="22"/>
+        </w:rPr>
+        <w:t xml:space="preserve">to be </w:t>
+      </w:r>
+      <w:r>
+        <w:rPr>
+          <w:sz w:val="22"/>
+          <w:szCs w:val="22"/>
+        </w:rPr>
+        <w:t>larger in magnitude. Stratifying by gender, we noticed that female patients generally had larger but more variable effect estimates; for AST, the obesity × Cushing's interaction among females was +41.9 mg/dL [−3.7, +87.5] versus +25.8 [+11.4, +40.1] among males.</w:t>
+      </w:r>
       <w:r>
         <w:rPr>
           <w:sz w:val="22"/>
@@ -21165,16 +21160,16 @@
         <mc:AlternateContent>
           <mc:Choice Requires="wps">
             <w:drawing>
-              <wp:anchor distT="0" distB="0" distL="114300" distR="114300" simplePos="0" relativeHeight="251669504" behindDoc="0" locked="0" layoutInCell="1" allowOverlap="1" wp14:anchorId="0B89F9B9" wp14:editId="07D88BD0">
+              <wp:anchor distT="0" distB="0" distL="114300" distR="114300" simplePos="0" relativeHeight="251669504" behindDoc="0" locked="0" layoutInCell="1" allowOverlap="1" wp14:anchorId="0B89F9B9" wp14:editId="01B7ED0F">
                 <wp:simplePos x="0" y="0"/>
                 <wp:positionH relativeFrom="column">
-                  <wp:posOffset>-236855</wp:posOffset>
+                  <wp:posOffset>-374015</wp:posOffset>
                 </wp:positionH>
                 <wp:positionV relativeFrom="paragraph">
-                  <wp:posOffset>-393700</wp:posOffset>
+                  <wp:posOffset>-533400</wp:posOffset>
                 </wp:positionV>
-                <wp:extent cx="6690995" cy="7482840"/>
-                <wp:effectExtent l="0" t="2222" r="0" b="0"/>
+                <wp:extent cx="6690995" cy="7757795"/>
+                <wp:effectExtent l="0" t="0" r="1905" b="1905"/>
                 <wp:wrapSquare wrapText="bothSides"/>
                 <wp:docPr id="1357914388" name="Text Box 1"/>
                 <wp:cNvGraphicFramePr/>
@@ -21185,7 +21180,7 @@
                       <wps:spPr>
                         <a:xfrm rot="5400000">
                           <a:off x="0" y="0"/>
-                          <a:ext cx="6690995" cy="7482840"/>
+                          <a:ext cx="6690995" cy="7757795"/>
                         </a:xfrm>
                         <a:prstGeom prst="rect">
                           <a:avLst/>
@@ -21220,15 +21215,44 @@
                                 <w:sz w:val="22"/>
                                 <w:szCs w:val="22"/>
                               </w:rPr>
-                              <w:t xml:space="preserve">  We report the estimate for the Cushing’s-Obesity interaction for each laboratory result as mean [95% confidence interval].  Each row describes a different analytical approach including subgroup analyses, and the inclusion of a more limited number of covariates.  Unless otherwise noted all models adjusted for age, gender, and race/ethnicity. We also report several alternate models for obesity including adjusting for BMI within the primary stratified analyses, treating BMI as a non-linear covariate using non-linear splines, and including BMI as part of the propensity matching approach. Asterisks indicate </w:t>
-                            </w:r>
-                            <w:proofErr w:type="spellStart"/>
+                              <w:t xml:space="preserve">  </w:t>
+                            </w:r>
                             <w:r>
                               <w:rPr>
                                 <w:sz w:val="22"/>
                                 <w:szCs w:val="22"/>
                               </w:rPr>
-                              <w:t>p</w:t>
+                              <w:t xml:space="preserve">We report the estimate for the Cushing's × obesity interaction for each laboratory result as mean [95% confidence interval], all scaled to represent the Cushing's effect difference across the lean-to-obese BMI shift (mean BMI ≥30 minus mean BMI &lt;30 kg/m²). Each row describes a different analytical approach, including subgroup analyses and models with a limited set of covariates. Unless otherwise noted, all models adjusted for age, gender, and race/ethnicity. We also report alternative specifications for obesity, including adjusting for BMI within the primary stratified analyses, treating BMI as a continuous predictor with a linear term, treating BMI as a non-linear covariate using a natural cubic spline (4 </w:t>
+                            </w:r>
+                            <w:proofErr w:type="spellStart"/>
+                            <w:r>
+                              <w:rPr>
+                                <w:sz w:val="22"/>
+                                <w:szCs w:val="22"/>
+                              </w:rPr>
+                              <w:t>df</w:t>
+                            </w:r>
+                            <w:proofErr w:type="spellEnd"/>
+                            <w:r>
+                              <w:rPr>
+                                <w:sz w:val="22"/>
+                                <w:szCs w:val="22"/>
+                              </w:rPr>
+                              <w:t xml:space="preserve">), and including BMI in </w:t>
+                            </w:r>
+                            <w:r>
+                              <w:rPr>
+                                <w:sz w:val="22"/>
+                                <w:szCs w:val="22"/>
+                              </w:rPr>
+                              <w:t xml:space="preserve">the </w:t>
+                            </w:r>
+                            <w:r>
+                              <w:rPr>
+                                <w:sz w:val="22"/>
+                                <w:szCs w:val="22"/>
+                              </w:rPr>
+                              <w:t>propensity matching. Asterisks indicate p</w:t>
                             </w:r>
                             <w:r>
                               <w:rPr>
@@ -21238,13 +21262,12 @@
                               </w:rPr>
                               <w:t>interaction</w:t>
                             </w:r>
-                            <w:proofErr w:type="spellEnd"/>
                             <w:r>
                               <w:rPr>
                                 <w:sz w:val="22"/>
                                 <w:szCs w:val="22"/>
                               </w:rPr>
-                              <w:t>&lt;0.05.</w:t>
+                              <w:t>&lt; 0.05.</w:t>
                             </w:r>
                           </w:p>
                           <w:tbl>
@@ -25155,7 +25178,7 @@
                                 <w:tcPr>
                                   <w:tcW w:w="1435" w:type="dxa"/>
                                   <w:noWrap/>
-                                  <w:hideMark/>
+                                  <w:vAlign w:val="bottom"/>
                                 </w:tcPr>
                                 <w:p>
                                   <w:pPr>
@@ -25168,12 +25191,10 @@
                                   </w:pPr>
                                   <w:r>
                                     <w:rPr>
-                                      <w:rFonts w:ascii="Aptos Narrow" w:eastAsia="Times New Roman" w:hAnsi="Aptos Narrow" w:cs="Times New Roman"/>
-                                      <w:color w:val="000000"/>
-                                      <w:kern w:val="0"/>
-                                      <w14:ligatures w14:val="none"/>
-                                    </w:rPr>
-                                    <w:t>BMI (Non-Linear)</w:t>
+                                      <w:rFonts w:ascii="Aptos Narrow" w:hAnsi="Aptos Narrow"/>
+                                      <w:color w:val="000000"/>
+                                    </w:rPr>
+                                    <w:t>BMI (Linear)</w:t>
                                   </w:r>
                                 </w:p>
                               </w:tc>
@@ -25181,7 +25202,7 @@
                                 <w:tcPr>
                                   <w:tcW w:w="1080" w:type="dxa"/>
                                   <w:noWrap/>
-                                  <w:hideMark/>
+                                  <w:vAlign w:val="bottom"/>
                                 </w:tcPr>
                                 <w:p>
                                   <w:pPr>
@@ -25196,49 +25217,22 @@
                                   </w:pPr>
                                   <w:r>
                                     <w:rPr>
-                                      <w:rFonts w:ascii="Aptos Narrow" w:eastAsia="Times New Roman" w:hAnsi="Aptos Narrow" w:cs="Times New Roman"/>
-                                      <w:color w:val="000000"/>
-                                      <w:kern w:val="0"/>
-                                      <w:sz w:val="15"/>
-                                      <w:szCs w:val="15"/>
-                                      <w14:ligatures w14:val="none"/>
-                                    </w:rPr>
-                                    <w:t xml:space="preserve">0.35 </w:t>
-                                  </w:r>
-                                </w:p>
-                                <w:p>
-                                  <w:pPr>
-                                    <w:rPr>
-                                      <w:rFonts w:ascii="Aptos Narrow" w:eastAsia="Times New Roman" w:hAnsi="Aptos Narrow" w:cs="Times New Roman"/>
-                                      <w:color w:val="000000"/>
-                                      <w:kern w:val="0"/>
-                                      <w:sz w:val="15"/>
-                                      <w:szCs w:val="15"/>
-                                      <w14:ligatures w14:val="none"/>
-                                    </w:rPr>
-                                  </w:pPr>
-                                  <w:r>
-                                    <w:rPr>
-                                      <w:rFonts w:ascii="Aptos Narrow" w:eastAsia="Times New Roman" w:hAnsi="Aptos Narrow" w:cs="Times New Roman"/>
-                                      <w:color w:val="000000"/>
-                                      <w:kern w:val="0"/>
-                                      <w:sz w:val="15"/>
-                                      <w:szCs w:val="15"/>
-                                      <w14:ligatures w14:val="none"/>
-                                    </w:rPr>
-                                    <w:t xml:space="preserve">[0.10, </w:t>
+                                      <w:rFonts w:ascii="Aptos Narrow" w:hAnsi="Aptos Narrow"/>
+                                      <w:color w:val="000000"/>
+                                      <w:sz w:val="15"/>
+                                      <w:szCs w:val="15"/>
+                                    </w:rPr>
+                                    <w:t>-4.19 [-7.11, -1.</w:t>
                                   </w:r>
                                   <w:proofErr w:type="gramStart"/>
                                   <w:r>
                                     <w:rPr>
-                                      <w:rFonts w:ascii="Aptos Narrow" w:eastAsia="Times New Roman" w:hAnsi="Aptos Narrow" w:cs="Times New Roman"/>
-                                      <w:color w:val="000000"/>
-                                      <w:kern w:val="0"/>
-                                      <w:sz w:val="15"/>
-                                      <w:szCs w:val="15"/>
-                                      <w14:ligatures w14:val="none"/>
-                                    </w:rPr>
-                                    <w:t>0.59]*</w:t>
+                                      <w:rFonts w:ascii="Aptos Narrow" w:hAnsi="Aptos Narrow"/>
+                                      <w:color w:val="000000"/>
+                                      <w:sz w:val="15"/>
+                                      <w:szCs w:val="15"/>
+                                    </w:rPr>
+                                    <w:t>26]*</w:t>
                                   </w:r>
                                   <w:proofErr w:type="gramEnd"/>
                                 </w:p>
@@ -25247,7 +25241,7 @@
                                 <w:tcPr>
                                   <w:tcW w:w="1080" w:type="dxa"/>
                                   <w:noWrap/>
-                                  <w:hideMark/>
+                                  <w:vAlign w:val="bottom"/>
                                 </w:tcPr>
                                 <w:p>
                                   <w:pPr>
@@ -25262,49 +25256,22 @@
                                   </w:pPr>
                                   <w:r>
                                     <w:rPr>
-                                      <w:rFonts w:ascii="Aptos Narrow" w:eastAsia="Times New Roman" w:hAnsi="Aptos Narrow" w:cs="Times New Roman"/>
-                                      <w:color w:val="000000"/>
-                                      <w:kern w:val="0"/>
-                                      <w:sz w:val="15"/>
-                                      <w:szCs w:val="15"/>
-                                      <w14:ligatures w14:val="none"/>
-                                    </w:rPr>
-                                    <w:t xml:space="preserve">-0.04 </w:t>
-                                  </w:r>
-                                </w:p>
-                                <w:p>
-                                  <w:pPr>
-                                    <w:rPr>
-                                      <w:rFonts w:ascii="Aptos Narrow" w:eastAsia="Times New Roman" w:hAnsi="Aptos Narrow" w:cs="Times New Roman"/>
-                                      <w:color w:val="000000"/>
-                                      <w:kern w:val="0"/>
-                                      <w:sz w:val="15"/>
-                                      <w:szCs w:val="15"/>
-                                      <w14:ligatures w14:val="none"/>
-                                    </w:rPr>
-                                  </w:pPr>
-                                  <w:r>
-                                    <w:rPr>
-                                      <w:rFonts w:ascii="Aptos Narrow" w:eastAsia="Times New Roman" w:hAnsi="Aptos Narrow" w:cs="Times New Roman"/>
-                                      <w:color w:val="000000"/>
-                                      <w:kern w:val="0"/>
-                                      <w:sz w:val="15"/>
-                                      <w:szCs w:val="15"/>
-                                      <w14:ligatures w14:val="none"/>
-                                    </w:rPr>
-                                    <w:t>[-0.09, -0.</w:t>
+                                      <w:rFonts w:ascii="Aptos Narrow" w:hAnsi="Aptos Narrow"/>
+                                      <w:color w:val="000000"/>
+                                      <w:sz w:val="15"/>
+                                      <w:szCs w:val="15"/>
+                                    </w:rPr>
+                                    <w:t xml:space="preserve">0.60 [0.03, </w:t>
                                   </w:r>
                                   <w:proofErr w:type="gramStart"/>
                                   <w:r>
                                     <w:rPr>
-                                      <w:rFonts w:ascii="Aptos Narrow" w:eastAsia="Times New Roman" w:hAnsi="Aptos Narrow" w:cs="Times New Roman"/>
-                                      <w:color w:val="000000"/>
-                                      <w:kern w:val="0"/>
-                                      <w:sz w:val="15"/>
-                                      <w:szCs w:val="15"/>
-                                      <w14:ligatures w14:val="none"/>
-                                    </w:rPr>
-                                    <w:t>00]*</w:t>
+                                      <w:rFonts w:ascii="Aptos Narrow" w:hAnsi="Aptos Narrow"/>
+                                      <w:color w:val="000000"/>
+                                      <w:sz w:val="15"/>
+                                      <w:szCs w:val="15"/>
+                                    </w:rPr>
+                                    <w:t>1.18]*</w:t>
                                   </w:r>
                                   <w:proofErr w:type="gramEnd"/>
                                 </w:p>
@@ -25313,7 +25280,7 @@
                                 <w:tcPr>
                                   <w:tcW w:w="1260" w:type="dxa"/>
                                   <w:noWrap/>
-                                  <w:hideMark/>
+                                  <w:vAlign w:val="bottom"/>
                                 </w:tcPr>
                                 <w:p>
                                   <w:pPr>
@@ -25328,49 +25295,22 @@
                                   </w:pPr>
                                   <w:r>
                                     <w:rPr>
-                                      <w:rFonts w:ascii="Aptos Narrow" w:eastAsia="Times New Roman" w:hAnsi="Aptos Narrow" w:cs="Times New Roman"/>
-                                      <w:color w:val="000000"/>
-                                      <w:kern w:val="0"/>
-                                      <w:sz w:val="15"/>
-                                      <w:szCs w:val="15"/>
-                                      <w14:ligatures w14:val="none"/>
-                                    </w:rPr>
-                                    <w:t xml:space="preserve">-3.36 </w:t>
-                                  </w:r>
-                                </w:p>
-                                <w:p>
-                                  <w:pPr>
-                                    <w:rPr>
-                                      <w:rFonts w:ascii="Aptos Narrow" w:eastAsia="Times New Roman" w:hAnsi="Aptos Narrow" w:cs="Times New Roman"/>
-                                      <w:color w:val="000000"/>
-                                      <w:kern w:val="0"/>
-                                      <w:sz w:val="15"/>
-                                      <w:szCs w:val="15"/>
-                                      <w14:ligatures w14:val="none"/>
-                                    </w:rPr>
-                                  </w:pPr>
-                                  <w:r>
-                                    <w:rPr>
-                                      <w:rFonts w:ascii="Aptos Narrow" w:eastAsia="Times New Roman" w:hAnsi="Aptos Narrow" w:cs="Times New Roman"/>
-                                      <w:color w:val="000000"/>
-                                      <w:kern w:val="0"/>
-                                      <w:sz w:val="15"/>
-                                      <w:szCs w:val="15"/>
-                                      <w14:ligatures w14:val="none"/>
-                                    </w:rPr>
-                                    <w:t>[-4.19, -2.</w:t>
+                                      <w:rFonts w:ascii="Aptos Narrow" w:hAnsi="Aptos Narrow"/>
+                                      <w:color w:val="000000"/>
+                                      <w:sz w:val="15"/>
+                                      <w:szCs w:val="15"/>
+                                    </w:rPr>
+                                    <w:t xml:space="preserve">41.87 [31.54, </w:t>
                                   </w:r>
                                   <w:proofErr w:type="gramStart"/>
                                   <w:r>
                                     <w:rPr>
-                                      <w:rFonts w:ascii="Aptos Narrow" w:eastAsia="Times New Roman" w:hAnsi="Aptos Narrow" w:cs="Times New Roman"/>
-                                      <w:color w:val="000000"/>
-                                      <w:kern w:val="0"/>
-                                      <w:sz w:val="15"/>
-                                      <w:szCs w:val="15"/>
-                                      <w14:ligatures w14:val="none"/>
-                                    </w:rPr>
-                                    <w:t>53]*</w:t>
+                                      <w:rFonts w:ascii="Aptos Narrow" w:hAnsi="Aptos Narrow"/>
+                                      <w:color w:val="000000"/>
+                                      <w:sz w:val="15"/>
+                                      <w:szCs w:val="15"/>
+                                    </w:rPr>
+                                    <w:t>52.19]*</w:t>
                                   </w:r>
                                   <w:proofErr w:type="gramEnd"/>
                                 </w:p>
@@ -25379,7 +25319,7 @@
                                 <w:tcPr>
                                   <w:tcW w:w="1260" w:type="dxa"/>
                                   <w:noWrap/>
-                                  <w:hideMark/>
+                                  <w:vAlign w:val="bottom"/>
                                 </w:tcPr>
                                 <w:p>
                                   <w:pPr>
@@ -25394,49 +25334,22 @@
                                   </w:pPr>
                                   <w:r>
                                     <w:rPr>
-                                      <w:rFonts w:ascii="Aptos Narrow" w:eastAsia="Times New Roman" w:hAnsi="Aptos Narrow" w:cs="Times New Roman"/>
-                                      <w:color w:val="000000"/>
-                                      <w:kern w:val="0"/>
-                                      <w:sz w:val="15"/>
-                                      <w:szCs w:val="15"/>
-                                      <w14:ligatures w14:val="none"/>
-                                    </w:rPr>
-                                    <w:t>-4.41</w:t>
-                                  </w:r>
-                                </w:p>
-                                <w:p>
-                                  <w:pPr>
-                                    <w:rPr>
-                                      <w:rFonts w:ascii="Aptos Narrow" w:eastAsia="Times New Roman" w:hAnsi="Aptos Narrow" w:cs="Times New Roman"/>
-                                      <w:color w:val="000000"/>
-                                      <w:kern w:val="0"/>
-                                      <w:sz w:val="15"/>
-                                      <w:szCs w:val="15"/>
-                                      <w14:ligatures w14:val="none"/>
-                                    </w:rPr>
-                                  </w:pPr>
-                                  <w:r>
-                                    <w:rPr>
-                                      <w:rFonts w:ascii="Aptos Narrow" w:eastAsia="Times New Roman" w:hAnsi="Aptos Narrow" w:cs="Times New Roman"/>
-                                      <w:color w:val="000000"/>
-                                      <w:kern w:val="0"/>
-                                      <w:sz w:val="15"/>
-                                      <w:szCs w:val="15"/>
-                                      <w14:ligatures w14:val="none"/>
-                                    </w:rPr>
-                                    <w:t xml:space="preserve"> [-6.36, -2.</w:t>
+                                      <w:rFonts w:ascii="Aptos Narrow" w:hAnsi="Aptos Narrow"/>
+                                      <w:color w:val="000000"/>
+                                      <w:sz w:val="15"/>
+                                      <w:szCs w:val="15"/>
+                                    </w:rPr>
+                                    <w:t xml:space="preserve">54.89 [30.65, </w:t>
                                   </w:r>
                                   <w:proofErr w:type="gramStart"/>
                                   <w:r>
                                     <w:rPr>
-                                      <w:rFonts w:ascii="Aptos Narrow" w:eastAsia="Times New Roman" w:hAnsi="Aptos Narrow" w:cs="Times New Roman"/>
-                                      <w:color w:val="000000"/>
-                                      <w:kern w:val="0"/>
-                                      <w:sz w:val="15"/>
-                                      <w:szCs w:val="15"/>
-                                      <w14:ligatures w14:val="none"/>
-                                    </w:rPr>
-                                    <w:t>46]*</w:t>
+                                      <w:rFonts w:ascii="Aptos Narrow" w:hAnsi="Aptos Narrow"/>
+                                      <w:color w:val="000000"/>
+                                      <w:sz w:val="15"/>
+                                      <w:szCs w:val="15"/>
+                                    </w:rPr>
+                                    <w:t>79.14]*</w:t>
                                   </w:r>
                                   <w:proofErr w:type="gramEnd"/>
                                 </w:p>
@@ -25445,7 +25358,7 @@
                                 <w:tcPr>
                                   <w:tcW w:w="1170" w:type="dxa"/>
                                   <w:noWrap/>
-                                  <w:hideMark/>
+                                  <w:vAlign w:val="bottom"/>
                                 </w:tcPr>
                                 <w:p>
                                   <w:pPr>
@@ -25460,49 +25373,22 @@
                                   </w:pPr>
                                   <w:r>
                                     <w:rPr>
-                                      <w:rFonts w:ascii="Aptos Narrow" w:eastAsia="Times New Roman" w:hAnsi="Aptos Narrow" w:cs="Times New Roman"/>
-                                      <w:color w:val="000000"/>
-                                      <w:kern w:val="0"/>
-                                      <w:sz w:val="15"/>
-                                      <w:szCs w:val="15"/>
-                                      <w14:ligatures w14:val="none"/>
-                                    </w:rPr>
-                                    <w:t>0.47</w:t>
-                                  </w:r>
-                                </w:p>
-                                <w:p>
-                                  <w:pPr>
-                                    <w:rPr>
-                                      <w:rFonts w:ascii="Aptos Narrow" w:eastAsia="Times New Roman" w:hAnsi="Aptos Narrow" w:cs="Times New Roman"/>
-                                      <w:color w:val="000000"/>
-                                      <w:kern w:val="0"/>
-                                      <w:sz w:val="15"/>
-                                      <w:szCs w:val="15"/>
-                                      <w14:ligatures w14:val="none"/>
-                                    </w:rPr>
-                                  </w:pPr>
-                                  <w:r>
-                                    <w:rPr>
-                                      <w:rFonts w:ascii="Aptos Narrow" w:eastAsia="Times New Roman" w:hAnsi="Aptos Narrow" w:cs="Times New Roman"/>
-                                      <w:color w:val="000000"/>
-                                      <w:kern w:val="0"/>
-                                      <w:sz w:val="15"/>
-                                      <w:szCs w:val="15"/>
-                                      <w14:ligatures w14:val="none"/>
-                                    </w:rPr>
-                                    <w:t xml:space="preserve"> [0.31, </w:t>
+                                      <w:rFonts w:ascii="Aptos Narrow" w:hAnsi="Aptos Narrow"/>
+                                      <w:color w:val="000000"/>
+                                      <w:sz w:val="15"/>
+                                      <w:szCs w:val="15"/>
+                                    </w:rPr>
+                                    <w:t>-5.71 [-7.73, -3.</w:t>
                                   </w:r>
                                   <w:proofErr w:type="gramStart"/>
                                   <w:r>
                                     <w:rPr>
-                                      <w:rFonts w:ascii="Aptos Narrow" w:eastAsia="Times New Roman" w:hAnsi="Aptos Narrow" w:cs="Times New Roman"/>
-                                      <w:color w:val="000000"/>
-                                      <w:kern w:val="0"/>
-                                      <w:sz w:val="15"/>
-                                      <w:szCs w:val="15"/>
-                                      <w14:ligatures w14:val="none"/>
-                                    </w:rPr>
-                                    <w:t>0.64]*</w:t>
+                                      <w:rFonts w:ascii="Aptos Narrow" w:hAnsi="Aptos Narrow"/>
+                                      <w:color w:val="000000"/>
+                                      <w:sz w:val="15"/>
+                                      <w:szCs w:val="15"/>
+                                    </w:rPr>
+                                    <w:t>69]*</w:t>
                                   </w:r>
                                   <w:proofErr w:type="gramEnd"/>
                                 </w:p>
@@ -25511,7 +25397,7 @@
                                 <w:tcPr>
                                   <w:tcW w:w="1170" w:type="dxa"/>
                                   <w:noWrap/>
-                                  <w:hideMark/>
+                                  <w:vAlign w:val="bottom"/>
                                 </w:tcPr>
                                 <w:p>
                                   <w:pPr>
@@ -25526,49 +25412,22 @@
                                   </w:pPr>
                                   <w:r>
                                     <w:rPr>
-                                      <w:rFonts w:ascii="Aptos Narrow" w:eastAsia="Times New Roman" w:hAnsi="Aptos Narrow" w:cs="Times New Roman"/>
-                                      <w:color w:val="000000"/>
-                                      <w:kern w:val="0"/>
-                                      <w:sz w:val="15"/>
-                                      <w:szCs w:val="15"/>
-                                      <w14:ligatures w14:val="none"/>
-                                    </w:rPr>
-                                    <w:t>0.62</w:t>
-                                  </w:r>
-                                </w:p>
-                                <w:p>
-                                  <w:pPr>
-                                    <w:rPr>
-                                      <w:rFonts w:ascii="Aptos Narrow" w:eastAsia="Times New Roman" w:hAnsi="Aptos Narrow" w:cs="Times New Roman"/>
-                                      <w:color w:val="000000"/>
-                                      <w:kern w:val="0"/>
-                                      <w:sz w:val="15"/>
-                                      <w:szCs w:val="15"/>
-                                      <w14:ligatures w14:val="none"/>
-                                    </w:rPr>
-                                  </w:pPr>
-                                  <w:r>
-                                    <w:rPr>
-                                      <w:rFonts w:ascii="Aptos Narrow" w:eastAsia="Times New Roman" w:hAnsi="Aptos Narrow" w:cs="Times New Roman"/>
-                                      <w:color w:val="000000"/>
-                                      <w:kern w:val="0"/>
-                                      <w:sz w:val="15"/>
-                                      <w:szCs w:val="15"/>
-                                      <w14:ligatures w14:val="none"/>
-                                    </w:rPr>
-                                    <w:t xml:space="preserve"> [0.37, </w:t>
+                                      <w:rFonts w:ascii="Aptos Narrow" w:hAnsi="Aptos Narrow"/>
+                                      <w:color w:val="000000"/>
+                                      <w:sz w:val="15"/>
+                                      <w:szCs w:val="15"/>
+                                    </w:rPr>
+                                    <w:t>-7.48 [-10.48, -4.</w:t>
                                   </w:r>
                                   <w:proofErr w:type="gramStart"/>
                                   <w:r>
                                     <w:rPr>
-                                      <w:rFonts w:ascii="Aptos Narrow" w:eastAsia="Times New Roman" w:hAnsi="Aptos Narrow" w:cs="Times New Roman"/>
-                                      <w:color w:val="000000"/>
-                                      <w:kern w:val="0"/>
-                                      <w:sz w:val="15"/>
-                                      <w:szCs w:val="15"/>
-                                      <w14:ligatures w14:val="none"/>
-                                    </w:rPr>
-                                    <w:t>0.87]*</w:t>
+                                      <w:rFonts w:ascii="Aptos Narrow" w:hAnsi="Aptos Narrow"/>
+                                      <w:color w:val="000000"/>
+                                      <w:sz w:val="15"/>
+                                      <w:szCs w:val="15"/>
+                                    </w:rPr>
+                                    <w:t>48]*</w:t>
                                   </w:r>
                                   <w:proofErr w:type="gramEnd"/>
                                 </w:p>
@@ -25577,7 +25436,7 @@
                                 <w:tcPr>
                                   <w:tcW w:w="1625" w:type="dxa"/>
                                   <w:noWrap/>
-                                  <w:hideMark/>
+                                  <w:vAlign w:val="bottom"/>
                                 </w:tcPr>
                                 <w:p>
                                   <w:pPr>
@@ -25592,49 +25451,291 @@
                                   </w:pPr>
                                   <w:r>
                                     <w:rPr>
-                                      <w:rFonts w:ascii="Aptos Narrow" w:eastAsia="Times New Roman" w:hAnsi="Aptos Narrow" w:cs="Times New Roman"/>
-                                      <w:color w:val="000000"/>
-                                      <w:kern w:val="0"/>
-                                      <w:sz w:val="15"/>
-                                      <w:szCs w:val="15"/>
-                                      <w14:ligatures w14:val="none"/>
-                                    </w:rPr>
-                                    <w:t>0.40</w:t>
-                                  </w:r>
-                                </w:p>
-                                <w:p>
-                                  <w:pPr>
-                                    <w:rPr>
-                                      <w:rFonts w:ascii="Aptos Narrow" w:eastAsia="Times New Roman" w:hAnsi="Aptos Narrow" w:cs="Times New Roman"/>
-                                      <w:color w:val="000000"/>
-                                      <w:kern w:val="0"/>
-                                      <w:sz w:val="15"/>
-                                      <w:szCs w:val="15"/>
-                                      <w14:ligatures w14:val="none"/>
-                                    </w:rPr>
-                                  </w:pPr>
-                                  <w:r>
-                                    <w:rPr>
-                                      <w:rFonts w:ascii="Aptos Narrow" w:eastAsia="Times New Roman" w:hAnsi="Aptos Narrow" w:cs="Times New Roman"/>
-                                      <w:color w:val="000000"/>
-                                      <w:kern w:val="0"/>
-                                      <w:sz w:val="15"/>
-                                      <w:szCs w:val="15"/>
-                                      <w14:ligatures w14:val="none"/>
-                                    </w:rPr>
-                                    <w:t xml:space="preserve"> [0.24, </w:t>
+                                      <w:rFonts w:ascii="Aptos Narrow" w:hAnsi="Aptos Narrow"/>
+                                      <w:color w:val="000000"/>
+                                      <w:sz w:val="15"/>
+                                      <w:szCs w:val="15"/>
+                                    </w:rPr>
+                                    <w:t>-4.86 [-6.80, -2.</w:t>
                                   </w:r>
                                   <w:proofErr w:type="gramStart"/>
                                   <w:r>
                                     <w:rPr>
-                                      <w:rFonts w:ascii="Aptos Narrow" w:eastAsia="Times New Roman" w:hAnsi="Aptos Narrow" w:cs="Times New Roman"/>
-                                      <w:color w:val="000000"/>
-                                      <w:kern w:val="0"/>
-                                      <w:sz w:val="15"/>
-                                      <w:szCs w:val="15"/>
-                                      <w14:ligatures w14:val="none"/>
-                                    </w:rPr>
-                                    <w:t>0.57]*</w:t>
+                                      <w:rFonts w:ascii="Aptos Narrow" w:hAnsi="Aptos Narrow"/>
+                                      <w:color w:val="000000"/>
+                                      <w:sz w:val="15"/>
+                                      <w:szCs w:val="15"/>
+                                    </w:rPr>
+                                    <w:t>93]*</w:t>
+                                  </w:r>
+                                  <w:proofErr w:type="gramEnd"/>
+                                </w:p>
+                              </w:tc>
+                            </w:tr>
+                            <w:tr>
+                              <w:trPr>
+                                <w:trHeight w:val="320"/>
+                              </w:trPr>
+                              <w:tc>
+                                <w:tcPr>
+                                  <w:tcW w:w="1435" w:type="dxa"/>
+                                  <w:noWrap/>
+                                  <w:vAlign w:val="bottom"/>
+                                </w:tcPr>
+                                <w:p>
+                                  <w:pPr>
+                                    <w:rPr>
+                                      <w:rFonts w:ascii="Aptos Narrow" w:eastAsia="Times New Roman" w:hAnsi="Aptos Narrow" w:cs="Times New Roman"/>
+                                      <w:color w:val="000000"/>
+                                      <w:kern w:val="0"/>
+                                      <w14:ligatures w14:val="none"/>
+                                    </w:rPr>
+                                  </w:pPr>
+                                  <w:r>
+                                    <w:rPr>
+                                      <w:rFonts w:ascii="Aptos Narrow" w:hAnsi="Aptos Narrow"/>
+                                      <w:color w:val="000000"/>
+                                    </w:rPr>
+                                    <w:t>BMI (Spline)</w:t>
+                                  </w:r>
+                                </w:p>
+                              </w:tc>
+                              <w:tc>
+                                <w:tcPr>
+                                  <w:tcW w:w="1080" w:type="dxa"/>
+                                  <w:noWrap/>
+                                  <w:vAlign w:val="bottom"/>
+                                </w:tcPr>
+                                <w:p>
+                                  <w:pPr>
+                                    <w:rPr>
+                                      <w:rFonts w:ascii="Aptos Narrow" w:eastAsia="Times New Roman" w:hAnsi="Aptos Narrow" w:cs="Times New Roman"/>
+                                      <w:color w:val="000000"/>
+                                      <w:kern w:val="0"/>
+                                      <w:sz w:val="15"/>
+                                      <w:szCs w:val="15"/>
+                                      <w14:ligatures w14:val="none"/>
+                                    </w:rPr>
+                                  </w:pPr>
+                                  <w:r>
+                                    <w:rPr>
+                                      <w:rFonts w:ascii="Aptos Narrow" w:hAnsi="Aptos Narrow"/>
+                                      <w:color w:val="000000"/>
+                                      <w:sz w:val="15"/>
+                                      <w:szCs w:val="15"/>
+                                    </w:rPr>
+                                    <w:t>0.31 [-8.35, 8.96]</w:t>
+                                  </w:r>
+                                </w:p>
+                              </w:tc>
+                              <w:tc>
+                                <w:tcPr>
+                                  <w:tcW w:w="1080" w:type="dxa"/>
+                                  <w:noWrap/>
+                                  <w:vAlign w:val="bottom"/>
+                                </w:tcPr>
+                                <w:p>
+                                  <w:pPr>
+                                    <w:rPr>
+                                      <w:rFonts w:ascii="Aptos Narrow" w:eastAsia="Times New Roman" w:hAnsi="Aptos Narrow" w:cs="Times New Roman"/>
+                                      <w:color w:val="000000"/>
+                                      <w:kern w:val="0"/>
+                                      <w:sz w:val="15"/>
+                                      <w:szCs w:val="15"/>
+                                      <w14:ligatures w14:val="none"/>
+                                    </w:rPr>
+                                  </w:pPr>
+                                  <w:r>
+                                    <w:rPr>
+                                      <w:rFonts w:ascii="Aptos Narrow" w:hAnsi="Aptos Narrow"/>
+                                      <w:color w:val="000000"/>
+                                      <w:sz w:val="15"/>
+                                      <w:szCs w:val="15"/>
+                                    </w:rPr>
+                                    <w:t>-0.46 [-1.85, 0.93]</w:t>
+                                  </w:r>
+                                </w:p>
+                              </w:tc>
+                              <w:tc>
+                                <w:tcPr>
+                                  <w:tcW w:w="1260" w:type="dxa"/>
+                                  <w:noWrap/>
+                                  <w:vAlign w:val="bottom"/>
+                                </w:tcPr>
+                                <w:p>
+                                  <w:pPr>
+                                    <w:rPr>
+                                      <w:rFonts w:ascii="Aptos Narrow" w:eastAsia="Times New Roman" w:hAnsi="Aptos Narrow" w:cs="Times New Roman"/>
+                                      <w:color w:val="000000"/>
+                                      <w:kern w:val="0"/>
+                                      <w:sz w:val="15"/>
+                                      <w:szCs w:val="15"/>
+                                      <w14:ligatures w14:val="none"/>
+                                    </w:rPr>
+                                  </w:pPr>
+                                  <w:r>
+                                    <w:rPr>
+                                      <w:rFonts w:ascii="Aptos Narrow" w:hAnsi="Aptos Narrow"/>
+                                      <w:color w:val="000000"/>
+                                      <w:sz w:val="15"/>
+                                      <w:szCs w:val="15"/>
+                                    </w:rPr>
+                                    <w:t xml:space="preserve">29.06 [8.70, </w:t>
+                                  </w:r>
+                                  <w:proofErr w:type="gramStart"/>
+                                  <w:r>
+                                    <w:rPr>
+                                      <w:rFonts w:ascii="Aptos Narrow" w:hAnsi="Aptos Narrow"/>
+                                      <w:color w:val="000000"/>
+                                      <w:sz w:val="15"/>
+                                      <w:szCs w:val="15"/>
+                                    </w:rPr>
+                                    <w:t>49.42]*</w:t>
+                                  </w:r>
+                                  <w:proofErr w:type="gramEnd"/>
+                                </w:p>
+                              </w:tc>
+                              <w:tc>
+                                <w:tcPr>
+                                  <w:tcW w:w="1260" w:type="dxa"/>
+                                  <w:noWrap/>
+                                  <w:vAlign w:val="bottom"/>
+                                </w:tcPr>
+                                <w:p>
+                                  <w:pPr>
+                                    <w:rPr>
+                                      <w:rFonts w:ascii="Aptos Narrow" w:eastAsia="Times New Roman" w:hAnsi="Aptos Narrow" w:cs="Times New Roman"/>
+                                      <w:color w:val="000000"/>
+                                      <w:kern w:val="0"/>
+                                      <w:sz w:val="15"/>
+                                      <w:szCs w:val="15"/>
+                                      <w14:ligatures w14:val="none"/>
+                                    </w:rPr>
+                                  </w:pPr>
+                                  <w:r>
+                                    <w:rPr>
+                                      <w:rFonts w:ascii="Aptos Narrow" w:hAnsi="Aptos Narrow"/>
+                                      <w:color w:val="000000"/>
+                                      <w:sz w:val="15"/>
+                                      <w:szCs w:val="15"/>
+                                    </w:rPr>
+                                    <w:t>30.81 [-17.26, 78.87]</w:t>
+                                  </w:r>
+                                </w:p>
+                              </w:tc>
+                              <w:tc>
+                                <w:tcPr>
+                                  <w:tcW w:w="1170" w:type="dxa"/>
+                                  <w:noWrap/>
+                                  <w:vAlign w:val="bottom"/>
+                                </w:tcPr>
+                                <w:p>
+                                  <w:pPr>
+                                    <w:rPr>
+                                      <w:rFonts w:ascii="Aptos Narrow" w:eastAsia="Times New Roman" w:hAnsi="Aptos Narrow" w:cs="Times New Roman"/>
+                                      <w:color w:val="000000"/>
+                                      <w:kern w:val="0"/>
+                                      <w:sz w:val="15"/>
+                                      <w:szCs w:val="15"/>
+                                      <w14:ligatures w14:val="none"/>
+                                    </w:rPr>
+                                  </w:pPr>
+                                  <w:r>
+                                    <w:rPr>
+                                      <w:rFonts w:ascii="Aptos Narrow" w:hAnsi="Aptos Narrow"/>
+                                      <w:color w:val="000000"/>
+                                      <w:sz w:val="15"/>
+                                      <w:szCs w:val="15"/>
+                                    </w:rPr>
+                                    <w:t>-11.13 [-15.66, -6.</w:t>
+                                  </w:r>
+                                  <w:proofErr w:type="gramStart"/>
+                                  <w:r>
+                                    <w:rPr>
+                                      <w:rFonts w:ascii="Aptos Narrow" w:hAnsi="Aptos Narrow"/>
+                                      <w:color w:val="000000"/>
+                                      <w:sz w:val="15"/>
+                                      <w:szCs w:val="15"/>
+                                    </w:rPr>
+                                    <w:t>60]*</w:t>
+                                  </w:r>
+                                  <w:proofErr w:type="gramEnd"/>
+                                </w:p>
+                              </w:tc>
+                              <w:tc>
+                                <w:tcPr>
+                                  <w:tcW w:w="1170" w:type="dxa"/>
+                                  <w:noWrap/>
+                                  <w:vAlign w:val="bottom"/>
+                                </w:tcPr>
+                                <w:p>
+                                  <w:pPr>
+                                    <w:rPr>
+                                      <w:rFonts w:ascii="Aptos Narrow" w:eastAsia="Times New Roman" w:hAnsi="Aptos Narrow" w:cs="Times New Roman"/>
+                                      <w:color w:val="000000"/>
+                                      <w:kern w:val="0"/>
+                                      <w:sz w:val="15"/>
+                                      <w:szCs w:val="15"/>
+                                      <w14:ligatures w14:val="none"/>
+                                    </w:rPr>
+                                  </w:pPr>
+                                  <w:r>
+                                    <w:rPr>
+                                      <w:rFonts w:ascii="Aptos Narrow" w:hAnsi="Aptos Narrow"/>
+                                      <w:color w:val="000000"/>
+                                      <w:sz w:val="15"/>
+                                      <w:szCs w:val="15"/>
+                                    </w:rPr>
+                                    <w:t>-16.05 [-22.78, -9.</w:t>
+                                  </w:r>
+                                  <w:proofErr w:type="gramStart"/>
+                                  <w:r>
+                                    <w:rPr>
+                                      <w:rFonts w:ascii="Aptos Narrow" w:hAnsi="Aptos Narrow"/>
+                                      <w:color w:val="000000"/>
+                                      <w:sz w:val="15"/>
+                                      <w:szCs w:val="15"/>
+                                    </w:rPr>
+                                    <w:t>32]*</w:t>
+                                  </w:r>
+                                  <w:proofErr w:type="gramEnd"/>
+                                </w:p>
+                              </w:tc>
+                              <w:tc>
+                                <w:tcPr>
+                                  <w:tcW w:w="1625" w:type="dxa"/>
+                                  <w:noWrap/>
+                                  <w:vAlign w:val="bottom"/>
+                                </w:tcPr>
+                                <w:p>
+                                  <w:pPr>
+                                    <w:rPr>
+                                      <w:rFonts w:ascii="Aptos Narrow" w:eastAsia="Times New Roman" w:hAnsi="Aptos Narrow" w:cs="Times New Roman"/>
+                                      <w:color w:val="000000"/>
+                                      <w:kern w:val="0"/>
+                                      <w:sz w:val="15"/>
+                                      <w:szCs w:val="15"/>
+                                      <w14:ligatures w14:val="none"/>
+                                    </w:rPr>
+                                  </w:pPr>
+                                  <w:r>
+                                    <w:rPr>
+                                      <w:rFonts w:ascii="Aptos Narrow" w:hAnsi="Aptos Narrow"/>
+                                      <w:color w:val="000000"/>
+                                      <w:sz w:val="15"/>
+                                      <w:szCs w:val="15"/>
+                                    </w:rPr>
+                                    <w:t>-8.57 [-12.91, -4.</w:t>
+                                  </w:r>
+                                  <w:proofErr w:type="gramStart"/>
+                                  <w:r>
+                                    <w:rPr>
+                                      <w:rFonts w:ascii="Aptos Narrow" w:hAnsi="Aptos Narrow"/>
+                                      <w:color w:val="000000"/>
+                                      <w:sz w:val="15"/>
+                                      <w:szCs w:val="15"/>
+                                    </w:rPr>
+                                    <w:t>22]*</w:t>
                                   </w:r>
                                   <w:proofErr w:type="gramEnd"/>
                                 </w:p>
@@ -27519,7 +27620,7 @@
           </mc:Choice>
           <mc:Fallback>
             <w:pict>
-              <v:shape w14:anchorId="0B89F9B9" id="_x0000_s1031" type="#_x0000_t202" style="position:absolute;margin-left:-18.65pt;margin-top:-31pt;width:526.85pt;height:589.2pt;rotation:90;z-index:251669504;visibility:visible;mso-wrap-style:square;mso-width-percent:0;mso-height-percent:0;mso-wrap-distance-left:9pt;mso-wrap-distance-top:0;mso-wrap-distance-right:9pt;mso-wrap-distance-bottom:0;mso-position-horizontal:absolute;mso-position-horizontal-relative:text;mso-position-vertical:absolute;mso-position-vertical-relative:text;mso-width-percent:0;mso-height-percent:0;mso-width-relative:margin;mso-height-relative:margin;v-text-anchor:top" o:gfxdata="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" fillcolor="white [3201]" stroked="f" strokeweight=".5pt">
+              <v:shape w14:anchorId="0B89F9B9" id="_x0000_s1031" type="#_x0000_t202" style="position:absolute;margin-left:-29.45pt;margin-top:-42pt;width:526.85pt;height:610.85pt;rotation:90;z-index:251669504;visibility:visible;mso-wrap-style:square;mso-width-percent:0;mso-height-percent:0;mso-wrap-distance-left:9pt;mso-wrap-distance-top:0;mso-wrap-distance-right:9pt;mso-wrap-distance-bottom:0;mso-position-horizontal:absolute;mso-position-horizontal-relative:text;mso-position-vertical:absolute;mso-position-vertical-relative:text;mso-width-percent:0;mso-height-percent:0;mso-width-relative:margin;mso-height-relative:margin;v-text-anchor:top" o:gfxdata="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" fillcolor="white [3201]" stroked="f" strokeweight=".5pt">
                 <v:textbox>
                   <w:txbxContent>
                     <w:p>
@@ -27543,7 +27644,14 @@
                           <w:sz w:val="22"/>
                           <w:szCs w:val="22"/>
                         </w:rPr>
-                        <w:t xml:space="preserve">  We report the estimate for the Cushing’s-Obesity interaction for each laboratory result as mean [95% confidence interval].  Each row describes a different analytical approach including subgroup analyses, and the inclusion of a more limited number of covariates.  Unless otherwise noted all models adjusted for age, gender, and race/ethnicity. We also report several alternate models for obesity including adjusting for BMI within the primary stratified analyses, treating BMI as a non-linear covariate using non-linear splines, and including BMI as part of the propensity matching approach. Asterisks indicate </w:t>
+                        <w:t xml:space="preserve">  </w:t>
+                      </w:r>
+                      <w:r>
+                        <w:rPr>
+                          <w:sz w:val="22"/>
+                          <w:szCs w:val="22"/>
+                        </w:rPr>
+                        <w:t xml:space="preserve">We report the estimate for the Cushing's × obesity interaction for each laboratory result as mean [95% confidence interval], all scaled to represent the Cushing's effect difference across the lean-to-obese BMI shift (mean BMI ≥30 minus mean BMI &lt;30 kg/m²). Each row describes a different analytical approach, including subgroup analyses and models with a limited set of covariates. Unless otherwise noted, all models adjusted for age, gender, and race/ethnicity. We also report alternative specifications for obesity, including adjusting for BMI within the primary stratified analyses, treating BMI as a continuous predictor with a linear term, treating BMI as a non-linear covariate using a natural cubic spline (4 </w:t>
                       </w:r>
                       <w:proofErr w:type="spellStart"/>
                       <w:r>
@@ -27551,7 +27659,29 @@
                           <w:sz w:val="22"/>
                           <w:szCs w:val="22"/>
                         </w:rPr>
-                        <w:t>p</w:t>
+                        <w:t>df</w:t>
+                      </w:r>
+                      <w:proofErr w:type="spellEnd"/>
+                      <w:r>
+                        <w:rPr>
+                          <w:sz w:val="22"/>
+                          <w:szCs w:val="22"/>
+                        </w:rPr>
+                        <w:t xml:space="preserve">), and including BMI in </w:t>
+                      </w:r>
+                      <w:r>
+                        <w:rPr>
+                          <w:sz w:val="22"/>
+                          <w:szCs w:val="22"/>
+                        </w:rPr>
+                        <w:t xml:space="preserve">the </w:t>
+                      </w:r>
+                      <w:r>
+                        <w:rPr>
+                          <w:sz w:val="22"/>
+                          <w:szCs w:val="22"/>
+                        </w:rPr>
+                        <w:t>propensity matching. Asterisks indicate p</w:t>
                       </w:r>
                       <w:r>
                         <w:rPr>
@@ -27561,13 +27691,12 @@
                         </w:rPr>
                         <w:t>interaction</w:t>
                       </w:r>
-                      <w:proofErr w:type="spellEnd"/>
                       <w:r>
                         <w:rPr>
                           <w:sz w:val="22"/>
                           <w:szCs w:val="22"/>
                         </w:rPr>
-                        <w:t>&lt;0.05.</w:t>
+                        <w:t>&lt; 0.05.</w:t>
                       </w:r>
                     </w:p>
                     <w:tbl>
@@ -31478,7 +31607,7 @@
                           <w:tcPr>
                             <w:tcW w:w="1435" w:type="dxa"/>
                             <w:noWrap/>
-                            <w:hideMark/>
+                            <w:vAlign w:val="bottom"/>
                           </w:tcPr>
                           <w:p>
                             <w:pPr>
@@ -31491,12 +31620,10 @@
                             </w:pPr>
                             <w:r>
                               <w:rPr>
-                                <w:rFonts w:ascii="Aptos Narrow" w:eastAsia="Times New Roman" w:hAnsi="Aptos Narrow" w:cs="Times New Roman"/>
-                                <w:color w:val="000000"/>
-                                <w:kern w:val="0"/>
-                                <w14:ligatures w14:val="none"/>
-                              </w:rPr>
-                              <w:t>BMI (Non-Linear)</w:t>
+                                <w:rFonts w:ascii="Aptos Narrow" w:hAnsi="Aptos Narrow"/>
+                                <w:color w:val="000000"/>
+                              </w:rPr>
+                              <w:t>BMI (Linear)</w:t>
                             </w:r>
                           </w:p>
                         </w:tc>
@@ -31504,7 +31631,7 @@
                           <w:tcPr>
                             <w:tcW w:w="1080" w:type="dxa"/>
                             <w:noWrap/>
-                            <w:hideMark/>
+                            <w:vAlign w:val="bottom"/>
                           </w:tcPr>
                           <w:p>
                             <w:pPr>
@@ -31519,49 +31646,22 @@
                             </w:pPr>
                             <w:r>
                               <w:rPr>
-                                <w:rFonts w:ascii="Aptos Narrow" w:eastAsia="Times New Roman" w:hAnsi="Aptos Narrow" w:cs="Times New Roman"/>
-                                <w:color w:val="000000"/>
-                                <w:kern w:val="0"/>
-                                <w:sz w:val="15"/>
-                                <w:szCs w:val="15"/>
-                                <w14:ligatures w14:val="none"/>
-                              </w:rPr>
-                              <w:t xml:space="preserve">0.35 </w:t>
-                            </w:r>
-                          </w:p>
-                          <w:p>
-                            <w:pPr>
-                              <w:rPr>
-                                <w:rFonts w:ascii="Aptos Narrow" w:eastAsia="Times New Roman" w:hAnsi="Aptos Narrow" w:cs="Times New Roman"/>
-                                <w:color w:val="000000"/>
-                                <w:kern w:val="0"/>
-                                <w:sz w:val="15"/>
-                                <w:szCs w:val="15"/>
-                                <w14:ligatures w14:val="none"/>
-                              </w:rPr>
-                            </w:pPr>
-                            <w:r>
-                              <w:rPr>
-                                <w:rFonts w:ascii="Aptos Narrow" w:eastAsia="Times New Roman" w:hAnsi="Aptos Narrow" w:cs="Times New Roman"/>
-                                <w:color w:val="000000"/>
-                                <w:kern w:val="0"/>
-                                <w:sz w:val="15"/>
-                                <w:szCs w:val="15"/>
-                                <w14:ligatures w14:val="none"/>
-                              </w:rPr>
-                              <w:t xml:space="preserve">[0.10, </w:t>
+                                <w:rFonts w:ascii="Aptos Narrow" w:hAnsi="Aptos Narrow"/>
+                                <w:color w:val="000000"/>
+                                <w:sz w:val="15"/>
+                                <w:szCs w:val="15"/>
+                              </w:rPr>
+                              <w:t>-4.19 [-7.11, -1.</w:t>
                             </w:r>
                             <w:proofErr w:type="gramStart"/>
                             <w:r>
                               <w:rPr>
-                                <w:rFonts w:ascii="Aptos Narrow" w:eastAsia="Times New Roman" w:hAnsi="Aptos Narrow" w:cs="Times New Roman"/>
-                                <w:color w:val="000000"/>
-                                <w:kern w:val="0"/>
-                                <w:sz w:val="15"/>
-                                <w:szCs w:val="15"/>
-                                <w14:ligatures w14:val="none"/>
-                              </w:rPr>
-                              <w:t>0.59]*</w:t>
+                                <w:rFonts w:ascii="Aptos Narrow" w:hAnsi="Aptos Narrow"/>
+                                <w:color w:val="000000"/>
+                                <w:sz w:val="15"/>
+                                <w:szCs w:val="15"/>
+                              </w:rPr>
+                              <w:t>26]*</w:t>
                             </w:r>
                             <w:proofErr w:type="gramEnd"/>
                           </w:p>
@@ -31570,7 +31670,7 @@
                           <w:tcPr>
                             <w:tcW w:w="1080" w:type="dxa"/>
                             <w:noWrap/>
-                            <w:hideMark/>
+                            <w:vAlign w:val="bottom"/>
                           </w:tcPr>
                           <w:p>
                             <w:pPr>
@@ -31585,49 +31685,22 @@
                             </w:pPr>
                             <w:r>
                               <w:rPr>
-                                <w:rFonts w:ascii="Aptos Narrow" w:eastAsia="Times New Roman" w:hAnsi="Aptos Narrow" w:cs="Times New Roman"/>
-                                <w:color w:val="000000"/>
-                                <w:kern w:val="0"/>
-                                <w:sz w:val="15"/>
-                                <w:szCs w:val="15"/>
-                                <w14:ligatures w14:val="none"/>
-                              </w:rPr>
-                              <w:t xml:space="preserve">-0.04 </w:t>
-                            </w:r>
-                          </w:p>
-                          <w:p>
-                            <w:pPr>
-                              <w:rPr>
-                                <w:rFonts w:ascii="Aptos Narrow" w:eastAsia="Times New Roman" w:hAnsi="Aptos Narrow" w:cs="Times New Roman"/>
-                                <w:color w:val="000000"/>
-                                <w:kern w:val="0"/>
-                                <w:sz w:val="15"/>
-                                <w:szCs w:val="15"/>
-                                <w14:ligatures w14:val="none"/>
-                              </w:rPr>
-                            </w:pPr>
-                            <w:r>
-                              <w:rPr>
-                                <w:rFonts w:ascii="Aptos Narrow" w:eastAsia="Times New Roman" w:hAnsi="Aptos Narrow" w:cs="Times New Roman"/>
-                                <w:color w:val="000000"/>
-                                <w:kern w:val="0"/>
-                                <w:sz w:val="15"/>
-                                <w:szCs w:val="15"/>
-                                <w14:ligatures w14:val="none"/>
-                              </w:rPr>
-                              <w:t>[-0.09, -0.</w:t>
+                                <w:rFonts w:ascii="Aptos Narrow" w:hAnsi="Aptos Narrow"/>
+                                <w:color w:val="000000"/>
+                                <w:sz w:val="15"/>
+                                <w:szCs w:val="15"/>
+                              </w:rPr>
+                              <w:t xml:space="preserve">0.60 [0.03, </w:t>
                             </w:r>
                             <w:proofErr w:type="gramStart"/>
                             <w:r>
                               <w:rPr>
-                                <w:rFonts w:ascii="Aptos Narrow" w:eastAsia="Times New Roman" w:hAnsi="Aptos Narrow" w:cs="Times New Roman"/>
-                                <w:color w:val="000000"/>
-                                <w:kern w:val="0"/>
-                                <w:sz w:val="15"/>
-                                <w:szCs w:val="15"/>
-                                <w14:ligatures w14:val="none"/>
-                              </w:rPr>
-                              <w:t>00]*</w:t>
+                                <w:rFonts w:ascii="Aptos Narrow" w:hAnsi="Aptos Narrow"/>
+                                <w:color w:val="000000"/>
+                                <w:sz w:val="15"/>
+                                <w:szCs w:val="15"/>
+                              </w:rPr>
+                              <w:t>1.18]*</w:t>
                             </w:r>
                             <w:proofErr w:type="gramEnd"/>
                           </w:p>
@@ -31636,7 +31709,7 @@
                           <w:tcPr>
                             <w:tcW w:w="1260" w:type="dxa"/>
                             <w:noWrap/>
-                            <w:hideMark/>
+                            <w:vAlign w:val="bottom"/>
                           </w:tcPr>
                           <w:p>
                             <w:pPr>
@@ -31651,49 +31724,22 @@
                             </w:pPr>
                             <w:r>
                               <w:rPr>
-                                <w:rFonts w:ascii="Aptos Narrow" w:eastAsia="Times New Roman" w:hAnsi="Aptos Narrow" w:cs="Times New Roman"/>
-                                <w:color w:val="000000"/>
-                                <w:kern w:val="0"/>
-                                <w:sz w:val="15"/>
-                                <w:szCs w:val="15"/>
-                                <w14:ligatures w14:val="none"/>
-                              </w:rPr>
-                              <w:t xml:space="preserve">-3.36 </w:t>
-                            </w:r>
-                          </w:p>
-                          <w:p>
-                            <w:pPr>
-                              <w:rPr>
-                                <w:rFonts w:ascii="Aptos Narrow" w:eastAsia="Times New Roman" w:hAnsi="Aptos Narrow" w:cs="Times New Roman"/>
-                                <w:color w:val="000000"/>
-                                <w:kern w:val="0"/>
-                                <w:sz w:val="15"/>
-                                <w:szCs w:val="15"/>
-                                <w14:ligatures w14:val="none"/>
-                              </w:rPr>
-                            </w:pPr>
-                            <w:r>
-                              <w:rPr>
-                                <w:rFonts w:ascii="Aptos Narrow" w:eastAsia="Times New Roman" w:hAnsi="Aptos Narrow" w:cs="Times New Roman"/>
-                                <w:color w:val="000000"/>
-                                <w:kern w:val="0"/>
-                                <w:sz w:val="15"/>
-                                <w:szCs w:val="15"/>
-                                <w14:ligatures w14:val="none"/>
-                              </w:rPr>
-                              <w:t>[-4.19, -2.</w:t>
+                                <w:rFonts w:ascii="Aptos Narrow" w:hAnsi="Aptos Narrow"/>
+                                <w:color w:val="000000"/>
+                                <w:sz w:val="15"/>
+                                <w:szCs w:val="15"/>
+                              </w:rPr>
+                              <w:t xml:space="preserve">41.87 [31.54, </w:t>
                             </w:r>
                             <w:proofErr w:type="gramStart"/>
                             <w:r>
                               <w:rPr>
-                                <w:rFonts w:ascii="Aptos Narrow" w:eastAsia="Times New Roman" w:hAnsi="Aptos Narrow" w:cs="Times New Roman"/>
-                                <w:color w:val="000000"/>
-                                <w:kern w:val="0"/>
-                                <w:sz w:val="15"/>
-                                <w:szCs w:val="15"/>
-                                <w14:ligatures w14:val="none"/>
-                              </w:rPr>
-                              <w:t>53]*</w:t>
+                                <w:rFonts w:ascii="Aptos Narrow" w:hAnsi="Aptos Narrow"/>
+                                <w:color w:val="000000"/>
+                                <w:sz w:val="15"/>
+                                <w:szCs w:val="15"/>
+                              </w:rPr>
+                              <w:t>52.19]*</w:t>
                             </w:r>
                             <w:proofErr w:type="gramEnd"/>
                           </w:p>
@@ -31702,7 +31748,7 @@
                           <w:tcPr>
                             <w:tcW w:w="1260" w:type="dxa"/>
                             <w:noWrap/>
-                            <w:hideMark/>
+                            <w:vAlign w:val="bottom"/>
                           </w:tcPr>
                           <w:p>
                             <w:pPr>
@@ -31717,49 +31763,22 @@
                             </w:pPr>
                             <w:r>
                               <w:rPr>
-                                <w:rFonts w:ascii="Aptos Narrow" w:eastAsia="Times New Roman" w:hAnsi="Aptos Narrow" w:cs="Times New Roman"/>
-                                <w:color w:val="000000"/>
-                                <w:kern w:val="0"/>
-                                <w:sz w:val="15"/>
-                                <w:szCs w:val="15"/>
-                                <w14:ligatures w14:val="none"/>
-                              </w:rPr>
-                              <w:t>-4.41</w:t>
-                            </w:r>
-                          </w:p>
-                          <w:p>
-                            <w:pPr>
-                              <w:rPr>
-                                <w:rFonts w:ascii="Aptos Narrow" w:eastAsia="Times New Roman" w:hAnsi="Aptos Narrow" w:cs="Times New Roman"/>
-                                <w:color w:val="000000"/>
-                                <w:kern w:val="0"/>
-                                <w:sz w:val="15"/>
-                                <w:szCs w:val="15"/>
-                                <w14:ligatures w14:val="none"/>
-                              </w:rPr>
-                            </w:pPr>
-                            <w:r>
-                              <w:rPr>
-                                <w:rFonts w:ascii="Aptos Narrow" w:eastAsia="Times New Roman" w:hAnsi="Aptos Narrow" w:cs="Times New Roman"/>
-                                <w:color w:val="000000"/>
-                                <w:kern w:val="0"/>
-                                <w:sz w:val="15"/>
-                                <w:szCs w:val="15"/>
-                                <w14:ligatures w14:val="none"/>
-                              </w:rPr>
-                              <w:t xml:space="preserve"> [-6.36, -2.</w:t>
+                                <w:rFonts w:ascii="Aptos Narrow" w:hAnsi="Aptos Narrow"/>
+                                <w:color w:val="000000"/>
+                                <w:sz w:val="15"/>
+                                <w:szCs w:val="15"/>
+                              </w:rPr>
+                              <w:t xml:space="preserve">54.89 [30.65, </w:t>
                             </w:r>
                             <w:proofErr w:type="gramStart"/>
                             <w:r>
                               <w:rPr>
-                                <w:rFonts w:ascii="Aptos Narrow" w:eastAsia="Times New Roman" w:hAnsi="Aptos Narrow" w:cs="Times New Roman"/>
-                                <w:color w:val="000000"/>
-                                <w:kern w:val="0"/>
-                                <w:sz w:val="15"/>
-                                <w:szCs w:val="15"/>
-                                <w14:ligatures w14:val="none"/>
-                              </w:rPr>
-                              <w:t>46]*</w:t>
+                                <w:rFonts w:ascii="Aptos Narrow" w:hAnsi="Aptos Narrow"/>
+                                <w:color w:val="000000"/>
+                                <w:sz w:val="15"/>
+                                <w:szCs w:val="15"/>
+                              </w:rPr>
+                              <w:t>79.14]*</w:t>
                             </w:r>
                             <w:proofErr w:type="gramEnd"/>
                           </w:p>
@@ -31768,7 +31787,7 @@
                           <w:tcPr>
                             <w:tcW w:w="1170" w:type="dxa"/>
                             <w:noWrap/>
-                            <w:hideMark/>
+                            <w:vAlign w:val="bottom"/>
                           </w:tcPr>
                           <w:p>
                             <w:pPr>
@@ -31783,49 +31802,22 @@
                             </w:pPr>
                             <w:r>
                               <w:rPr>
-                                <w:rFonts w:ascii="Aptos Narrow" w:eastAsia="Times New Roman" w:hAnsi="Aptos Narrow" w:cs="Times New Roman"/>
-                                <w:color w:val="000000"/>
-                                <w:kern w:val="0"/>
-                                <w:sz w:val="15"/>
-                                <w:szCs w:val="15"/>
-                                <w14:ligatures w14:val="none"/>
-                              </w:rPr>
-                              <w:t>0.47</w:t>
-                            </w:r>
-                          </w:p>
-                          <w:p>
-                            <w:pPr>
-                              <w:rPr>
-                                <w:rFonts w:ascii="Aptos Narrow" w:eastAsia="Times New Roman" w:hAnsi="Aptos Narrow" w:cs="Times New Roman"/>
-                                <w:color w:val="000000"/>
-                                <w:kern w:val="0"/>
-                                <w:sz w:val="15"/>
-                                <w:szCs w:val="15"/>
-                                <w14:ligatures w14:val="none"/>
-                              </w:rPr>
-                            </w:pPr>
-                            <w:r>
-                              <w:rPr>
-                                <w:rFonts w:ascii="Aptos Narrow" w:eastAsia="Times New Roman" w:hAnsi="Aptos Narrow" w:cs="Times New Roman"/>
-                                <w:color w:val="000000"/>
-                                <w:kern w:val="0"/>
-                                <w:sz w:val="15"/>
-                                <w:szCs w:val="15"/>
-                                <w14:ligatures w14:val="none"/>
-                              </w:rPr>
-                              <w:t xml:space="preserve"> [0.31, </w:t>
+                                <w:rFonts w:ascii="Aptos Narrow" w:hAnsi="Aptos Narrow"/>
+                                <w:color w:val="000000"/>
+                                <w:sz w:val="15"/>
+                                <w:szCs w:val="15"/>
+                              </w:rPr>
+                              <w:t>-5.71 [-7.73, -3.</w:t>
                             </w:r>
                             <w:proofErr w:type="gramStart"/>
                             <w:r>
                               <w:rPr>
-                                <w:rFonts w:ascii="Aptos Narrow" w:eastAsia="Times New Roman" w:hAnsi="Aptos Narrow" w:cs="Times New Roman"/>
-                                <w:color w:val="000000"/>
-                                <w:kern w:val="0"/>
-                                <w:sz w:val="15"/>
-                                <w:szCs w:val="15"/>
-                                <w14:ligatures w14:val="none"/>
-                              </w:rPr>
-                              <w:t>0.64]*</w:t>
+                                <w:rFonts w:ascii="Aptos Narrow" w:hAnsi="Aptos Narrow"/>
+                                <w:color w:val="000000"/>
+                                <w:sz w:val="15"/>
+                                <w:szCs w:val="15"/>
+                              </w:rPr>
+                              <w:t>69]*</w:t>
                             </w:r>
                             <w:proofErr w:type="gramEnd"/>
                           </w:p>
@@ -31834,7 +31826,7 @@
                           <w:tcPr>
                             <w:tcW w:w="1170" w:type="dxa"/>
                             <w:noWrap/>
-                            <w:hideMark/>
+                            <w:vAlign w:val="bottom"/>
                           </w:tcPr>
                           <w:p>
                             <w:pPr>
@@ -31849,49 +31841,22 @@
                             </w:pPr>
                             <w:r>
                               <w:rPr>
-                                <w:rFonts w:ascii="Aptos Narrow" w:eastAsia="Times New Roman" w:hAnsi="Aptos Narrow" w:cs="Times New Roman"/>
-                                <w:color w:val="000000"/>
-                                <w:kern w:val="0"/>
-                                <w:sz w:val="15"/>
-                                <w:szCs w:val="15"/>
-                                <w14:ligatures w14:val="none"/>
-                              </w:rPr>
-                              <w:t>0.62</w:t>
-                            </w:r>
-                          </w:p>
-                          <w:p>
-                            <w:pPr>
-                              <w:rPr>
-                                <w:rFonts w:ascii="Aptos Narrow" w:eastAsia="Times New Roman" w:hAnsi="Aptos Narrow" w:cs="Times New Roman"/>
-                                <w:color w:val="000000"/>
-                                <w:kern w:val="0"/>
-                                <w:sz w:val="15"/>
-                                <w:szCs w:val="15"/>
-                                <w14:ligatures w14:val="none"/>
-                              </w:rPr>
-                            </w:pPr>
-                            <w:r>
-                              <w:rPr>
-                                <w:rFonts w:ascii="Aptos Narrow" w:eastAsia="Times New Roman" w:hAnsi="Aptos Narrow" w:cs="Times New Roman"/>
-                                <w:color w:val="000000"/>
-                                <w:kern w:val="0"/>
-                                <w:sz w:val="15"/>
-                                <w:szCs w:val="15"/>
-                                <w14:ligatures w14:val="none"/>
-                              </w:rPr>
-                              <w:t xml:space="preserve"> [0.37, </w:t>
+                                <w:rFonts w:ascii="Aptos Narrow" w:hAnsi="Aptos Narrow"/>
+                                <w:color w:val="000000"/>
+                                <w:sz w:val="15"/>
+                                <w:szCs w:val="15"/>
+                              </w:rPr>
+                              <w:t>-7.48 [-10.48, -4.</w:t>
                             </w:r>
                             <w:proofErr w:type="gramStart"/>
                             <w:r>
                               <w:rPr>
-                                <w:rFonts w:ascii="Aptos Narrow" w:eastAsia="Times New Roman" w:hAnsi="Aptos Narrow" w:cs="Times New Roman"/>
-                                <w:color w:val="000000"/>
-                                <w:kern w:val="0"/>
-                                <w:sz w:val="15"/>
-                                <w:szCs w:val="15"/>
-                                <w14:ligatures w14:val="none"/>
-                              </w:rPr>
-                              <w:t>0.87]*</w:t>
+                                <w:rFonts w:ascii="Aptos Narrow" w:hAnsi="Aptos Narrow"/>
+                                <w:color w:val="000000"/>
+                                <w:sz w:val="15"/>
+                                <w:szCs w:val="15"/>
+                              </w:rPr>
+                              <w:t>48]*</w:t>
                             </w:r>
                             <w:proofErr w:type="gramEnd"/>
                           </w:p>
@@ -31900,7 +31865,7 @@
                           <w:tcPr>
                             <w:tcW w:w="1625" w:type="dxa"/>
                             <w:noWrap/>
-                            <w:hideMark/>
+                            <w:vAlign w:val="bottom"/>
                           </w:tcPr>
                           <w:p>
                             <w:pPr>
@@ -31915,49 +31880,291 @@
                             </w:pPr>
                             <w:r>
                               <w:rPr>
-                                <w:rFonts w:ascii="Aptos Narrow" w:eastAsia="Times New Roman" w:hAnsi="Aptos Narrow" w:cs="Times New Roman"/>
-                                <w:color w:val="000000"/>
-                                <w:kern w:val="0"/>
-                                <w:sz w:val="15"/>
-                                <w:szCs w:val="15"/>
-                                <w14:ligatures w14:val="none"/>
-                              </w:rPr>
-                              <w:t>0.40</w:t>
-                            </w:r>
-                          </w:p>
-                          <w:p>
-                            <w:pPr>
-                              <w:rPr>
-                                <w:rFonts w:ascii="Aptos Narrow" w:eastAsia="Times New Roman" w:hAnsi="Aptos Narrow" w:cs="Times New Roman"/>
-                                <w:color w:val="000000"/>
-                                <w:kern w:val="0"/>
-                                <w:sz w:val="15"/>
-                                <w:szCs w:val="15"/>
-                                <w14:ligatures w14:val="none"/>
-                              </w:rPr>
-                            </w:pPr>
-                            <w:r>
-                              <w:rPr>
-                                <w:rFonts w:ascii="Aptos Narrow" w:eastAsia="Times New Roman" w:hAnsi="Aptos Narrow" w:cs="Times New Roman"/>
-                                <w:color w:val="000000"/>
-                                <w:kern w:val="0"/>
-                                <w:sz w:val="15"/>
-                                <w:szCs w:val="15"/>
-                                <w14:ligatures w14:val="none"/>
-                              </w:rPr>
-                              <w:t xml:space="preserve"> [0.24, </w:t>
+                                <w:rFonts w:ascii="Aptos Narrow" w:hAnsi="Aptos Narrow"/>
+                                <w:color w:val="000000"/>
+                                <w:sz w:val="15"/>
+                                <w:szCs w:val="15"/>
+                              </w:rPr>
+                              <w:t>-4.86 [-6.80, -2.</w:t>
                             </w:r>
                             <w:proofErr w:type="gramStart"/>
                             <w:r>
                               <w:rPr>
-                                <w:rFonts w:ascii="Aptos Narrow" w:eastAsia="Times New Roman" w:hAnsi="Aptos Narrow" w:cs="Times New Roman"/>
-                                <w:color w:val="000000"/>
-                                <w:kern w:val="0"/>
-                                <w:sz w:val="15"/>
-                                <w:szCs w:val="15"/>
-                                <w14:ligatures w14:val="none"/>
-                              </w:rPr>
-                              <w:t>0.57]*</w:t>
+                                <w:rFonts w:ascii="Aptos Narrow" w:hAnsi="Aptos Narrow"/>
+                                <w:color w:val="000000"/>
+                                <w:sz w:val="15"/>
+                                <w:szCs w:val="15"/>
+                              </w:rPr>
+                              <w:t>93]*</w:t>
+                            </w:r>
+                            <w:proofErr w:type="gramEnd"/>
+                          </w:p>
+                        </w:tc>
+                      </w:tr>
+                      <w:tr>
+                        <w:trPr>
+                          <w:trHeight w:val="320"/>
+                        </w:trPr>
+                        <w:tc>
+                          <w:tcPr>
+                            <w:tcW w:w="1435" w:type="dxa"/>
+                            <w:noWrap/>
+                            <w:vAlign w:val="bottom"/>
+                          </w:tcPr>
+                          <w:p>
+                            <w:pPr>
+                              <w:rPr>
+                                <w:rFonts w:ascii="Aptos Narrow" w:eastAsia="Times New Roman" w:hAnsi="Aptos Narrow" w:cs="Times New Roman"/>
+                                <w:color w:val="000000"/>
+                                <w:kern w:val="0"/>
+                                <w14:ligatures w14:val="none"/>
+                              </w:rPr>
+                            </w:pPr>
+                            <w:r>
+                              <w:rPr>
+                                <w:rFonts w:ascii="Aptos Narrow" w:hAnsi="Aptos Narrow"/>
+                                <w:color w:val="000000"/>
+                              </w:rPr>
+                              <w:t>BMI (Spline)</w:t>
+                            </w:r>
+                          </w:p>
+                        </w:tc>
+                        <w:tc>
+                          <w:tcPr>
+                            <w:tcW w:w="1080" w:type="dxa"/>
+                            <w:noWrap/>
+                            <w:vAlign w:val="bottom"/>
+                          </w:tcPr>
+                          <w:p>
+                            <w:pPr>
+                              <w:rPr>
+                                <w:rFonts w:ascii="Aptos Narrow" w:eastAsia="Times New Roman" w:hAnsi="Aptos Narrow" w:cs="Times New Roman"/>
+                                <w:color w:val="000000"/>
+                                <w:kern w:val="0"/>
+                                <w:sz w:val="15"/>
+                                <w:szCs w:val="15"/>
+                                <w14:ligatures w14:val="none"/>
+                              </w:rPr>
+                            </w:pPr>
+                            <w:r>
+                              <w:rPr>
+                                <w:rFonts w:ascii="Aptos Narrow" w:hAnsi="Aptos Narrow"/>
+                                <w:color w:val="000000"/>
+                                <w:sz w:val="15"/>
+                                <w:szCs w:val="15"/>
+                              </w:rPr>
+                              <w:t>0.31 [-8.35, 8.96]</w:t>
+                            </w:r>
+                          </w:p>
+                        </w:tc>
+                        <w:tc>
+                          <w:tcPr>
+                            <w:tcW w:w="1080" w:type="dxa"/>
+                            <w:noWrap/>
+                            <w:vAlign w:val="bottom"/>
+                          </w:tcPr>
+                          <w:p>
+                            <w:pPr>
+                              <w:rPr>
+                                <w:rFonts w:ascii="Aptos Narrow" w:eastAsia="Times New Roman" w:hAnsi="Aptos Narrow" w:cs="Times New Roman"/>
+                                <w:color w:val="000000"/>
+                                <w:kern w:val="0"/>
+                                <w:sz w:val="15"/>
+                                <w:szCs w:val="15"/>
+                                <w14:ligatures w14:val="none"/>
+                              </w:rPr>
+                            </w:pPr>
+                            <w:r>
+                              <w:rPr>
+                                <w:rFonts w:ascii="Aptos Narrow" w:hAnsi="Aptos Narrow"/>
+                                <w:color w:val="000000"/>
+                                <w:sz w:val="15"/>
+                                <w:szCs w:val="15"/>
+                              </w:rPr>
+                              <w:t>-0.46 [-1.85, 0.93]</w:t>
+                            </w:r>
+                          </w:p>
+                        </w:tc>
+                        <w:tc>
+                          <w:tcPr>
+                            <w:tcW w:w="1260" w:type="dxa"/>
+                            <w:noWrap/>
+                            <w:vAlign w:val="bottom"/>
+                          </w:tcPr>
+                          <w:p>
+                            <w:pPr>
+                              <w:rPr>
+                                <w:rFonts w:ascii="Aptos Narrow" w:eastAsia="Times New Roman" w:hAnsi="Aptos Narrow" w:cs="Times New Roman"/>
+                                <w:color w:val="000000"/>
+                                <w:kern w:val="0"/>
+                                <w:sz w:val="15"/>
+                                <w:szCs w:val="15"/>
+                                <w14:ligatures w14:val="none"/>
+                              </w:rPr>
+                            </w:pPr>
+                            <w:r>
+                              <w:rPr>
+                                <w:rFonts w:ascii="Aptos Narrow" w:hAnsi="Aptos Narrow"/>
+                                <w:color w:val="000000"/>
+                                <w:sz w:val="15"/>
+                                <w:szCs w:val="15"/>
+                              </w:rPr>
+                              <w:t xml:space="preserve">29.06 [8.70, </w:t>
+                            </w:r>
+                            <w:proofErr w:type="gramStart"/>
+                            <w:r>
+                              <w:rPr>
+                                <w:rFonts w:ascii="Aptos Narrow" w:hAnsi="Aptos Narrow"/>
+                                <w:color w:val="000000"/>
+                                <w:sz w:val="15"/>
+                                <w:szCs w:val="15"/>
+                              </w:rPr>
+                              <w:t>49.42]*</w:t>
+                            </w:r>
+                            <w:proofErr w:type="gramEnd"/>
+                          </w:p>
+                        </w:tc>
+                        <w:tc>
+                          <w:tcPr>
+                            <w:tcW w:w="1260" w:type="dxa"/>
+                            <w:noWrap/>
+                            <w:vAlign w:val="bottom"/>
+                          </w:tcPr>
+                          <w:p>
+                            <w:pPr>
+                              <w:rPr>
+                                <w:rFonts w:ascii="Aptos Narrow" w:eastAsia="Times New Roman" w:hAnsi="Aptos Narrow" w:cs="Times New Roman"/>
+                                <w:color w:val="000000"/>
+                                <w:kern w:val="0"/>
+                                <w:sz w:val="15"/>
+                                <w:szCs w:val="15"/>
+                                <w14:ligatures w14:val="none"/>
+                              </w:rPr>
+                            </w:pPr>
+                            <w:r>
+                              <w:rPr>
+                                <w:rFonts w:ascii="Aptos Narrow" w:hAnsi="Aptos Narrow"/>
+                                <w:color w:val="000000"/>
+                                <w:sz w:val="15"/>
+                                <w:szCs w:val="15"/>
+                              </w:rPr>
+                              <w:t>30.81 [-17.26, 78.87]</w:t>
+                            </w:r>
+                          </w:p>
+                        </w:tc>
+                        <w:tc>
+                          <w:tcPr>
+                            <w:tcW w:w="1170" w:type="dxa"/>
+                            <w:noWrap/>
+                            <w:vAlign w:val="bottom"/>
+                          </w:tcPr>
+                          <w:p>
+                            <w:pPr>
+                              <w:rPr>
+                                <w:rFonts w:ascii="Aptos Narrow" w:eastAsia="Times New Roman" w:hAnsi="Aptos Narrow" w:cs="Times New Roman"/>
+                                <w:color w:val="000000"/>
+                                <w:kern w:val="0"/>
+                                <w:sz w:val="15"/>
+                                <w:szCs w:val="15"/>
+                                <w14:ligatures w14:val="none"/>
+                              </w:rPr>
+                            </w:pPr>
+                            <w:r>
+                              <w:rPr>
+                                <w:rFonts w:ascii="Aptos Narrow" w:hAnsi="Aptos Narrow"/>
+                                <w:color w:val="000000"/>
+                                <w:sz w:val="15"/>
+                                <w:szCs w:val="15"/>
+                              </w:rPr>
+                              <w:t>-11.13 [-15.66, -6.</w:t>
+                            </w:r>
+                            <w:proofErr w:type="gramStart"/>
+                            <w:r>
+                              <w:rPr>
+                                <w:rFonts w:ascii="Aptos Narrow" w:hAnsi="Aptos Narrow"/>
+                                <w:color w:val="000000"/>
+                                <w:sz w:val="15"/>
+                                <w:szCs w:val="15"/>
+                              </w:rPr>
+                              <w:t>60]*</w:t>
+                            </w:r>
+                            <w:proofErr w:type="gramEnd"/>
+                          </w:p>
+                        </w:tc>
+                        <w:tc>
+                          <w:tcPr>
+                            <w:tcW w:w="1170" w:type="dxa"/>
+                            <w:noWrap/>
+                            <w:vAlign w:val="bottom"/>
+                          </w:tcPr>
+                          <w:p>
+                            <w:pPr>
+                              <w:rPr>
+                                <w:rFonts w:ascii="Aptos Narrow" w:eastAsia="Times New Roman" w:hAnsi="Aptos Narrow" w:cs="Times New Roman"/>
+                                <w:color w:val="000000"/>
+                                <w:kern w:val="0"/>
+                                <w:sz w:val="15"/>
+                                <w:szCs w:val="15"/>
+                                <w14:ligatures w14:val="none"/>
+                              </w:rPr>
+                            </w:pPr>
+                            <w:r>
+                              <w:rPr>
+                                <w:rFonts w:ascii="Aptos Narrow" w:hAnsi="Aptos Narrow"/>
+                                <w:color w:val="000000"/>
+                                <w:sz w:val="15"/>
+                                <w:szCs w:val="15"/>
+                              </w:rPr>
+                              <w:t>-16.05 [-22.78, -9.</w:t>
+                            </w:r>
+                            <w:proofErr w:type="gramStart"/>
+                            <w:r>
+                              <w:rPr>
+                                <w:rFonts w:ascii="Aptos Narrow" w:hAnsi="Aptos Narrow"/>
+                                <w:color w:val="000000"/>
+                                <w:sz w:val="15"/>
+                                <w:szCs w:val="15"/>
+                              </w:rPr>
+                              <w:t>32]*</w:t>
+                            </w:r>
+                            <w:proofErr w:type="gramEnd"/>
+                          </w:p>
+                        </w:tc>
+                        <w:tc>
+                          <w:tcPr>
+                            <w:tcW w:w="1625" w:type="dxa"/>
+                            <w:noWrap/>
+                            <w:vAlign w:val="bottom"/>
+                          </w:tcPr>
+                          <w:p>
+                            <w:pPr>
+                              <w:rPr>
+                                <w:rFonts w:ascii="Aptos Narrow" w:eastAsia="Times New Roman" w:hAnsi="Aptos Narrow" w:cs="Times New Roman"/>
+                                <w:color w:val="000000"/>
+                                <w:kern w:val="0"/>
+                                <w:sz w:val="15"/>
+                                <w:szCs w:val="15"/>
+                                <w14:ligatures w14:val="none"/>
+                              </w:rPr>
+                            </w:pPr>
+                            <w:r>
+                              <w:rPr>
+                                <w:rFonts w:ascii="Aptos Narrow" w:hAnsi="Aptos Narrow"/>
+                                <w:color w:val="000000"/>
+                                <w:sz w:val="15"/>
+                                <w:szCs w:val="15"/>
+                              </w:rPr>
+                              <w:t>-8.57 [-12.91, -4.</w:t>
+                            </w:r>
+                            <w:proofErr w:type="gramStart"/>
+                            <w:r>
+                              <w:rPr>
+                                <w:rFonts w:ascii="Aptos Narrow" w:hAnsi="Aptos Narrow"/>
+                                <w:color w:val="000000"/>
+                                <w:sz w:val="15"/>
+                                <w:szCs w:val="15"/>
+                              </w:rPr>
+                              <w:t>22]*</w:t>
                             </w:r>
                             <w:proofErr w:type="gramEnd"/>
                           </w:p>
@@ -33904,70 +34111,56 @@
           <w:sz w:val="22"/>
           <w:szCs w:val="22"/>
         </w:rPr>
-        <w:t xml:space="preserve"> a complex set of interactions between the presence of obesity on Cushing’s disease- and obesity-related pathophysiology.  We report that liver enzymes are enhanced relative to what we would predict from the additive effects of Cushing’s disease and obesity together, while in the case of blood pressure, obesity appears to reduce the effects of Cushing’s disease.  Glucose homeostasis appears to be explained well by an additive model</w:t>
-      </w:r>
-      <w:r>
-        <w:rPr>
-          <w:sz w:val="22"/>
-          <w:szCs w:val="22"/>
-        </w:rPr>
-        <w:t xml:space="preserve"> in our primary analysis</w:t>
-      </w:r>
-      <w:r>
-        <w:rPr>
-          <w:sz w:val="22"/>
-          <w:szCs w:val="22"/>
-        </w:rPr>
-        <w:t xml:space="preserve"> where obesity and Cushing’s disease have </w:t>
-      </w:r>
-      <w:r>
-        <w:rPr>
-          <w:sz w:val="22"/>
-          <w:szCs w:val="22"/>
-        </w:rPr>
-        <w:t>non-synergistic effects</w:t>
-      </w:r>
-      <w:r>
-        <w:rPr>
-          <w:sz w:val="22"/>
-          <w:szCs w:val="22"/>
-        </w:rPr>
-        <w:t>.</w:t>
-      </w:r>
-      <w:r>
-        <w:rPr>
-          <w:sz w:val="22"/>
-          <w:szCs w:val="22"/>
-        </w:rPr>
-        <w:t xml:space="preserve">  </w:t>
-      </w:r>
-      <w:r>
-        <w:rPr>
-          <w:sz w:val="22"/>
-          <w:szCs w:val="22"/>
-        </w:rPr>
-        <w:t xml:space="preserve">We see effects of both obesity and Cushing’s disease to increase blood glucose.  </w:t>
-      </w:r>
-      <w:r>
-        <w:rPr>
-          <w:sz w:val="22"/>
-          <w:szCs w:val="22"/>
-        </w:rPr>
-        <w:t xml:space="preserve">Broadly, </w:t>
-      </w:r>
-      <w:r>
-        <w:rPr>
-          <w:sz w:val="22"/>
-          <w:szCs w:val="22"/>
-        </w:rPr>
-        <w:t>despite</w:t>
-      </w:r>
-      <w:r>
-        <w:rPr>
-          <w:sz w:val="22"/>
-          <w:szCs w:val="22"/>
-        </w:rPr>
-        <w:t xml:space="preserve"> similar BMI levels between groups, metabolic dysfunction is dramatically worsened in patients with Cushing’s disease, so clearly there is substantial dysmetabolism beyond excessive weight gain.</w:t>
+        <w:t xml:space="preserve"> a complex set of interactions between the presence of obesity on Cushing’s disease- and obesity-related pathophysiology.  We report that liver enzymes are enhanced relative to what we would predict from the additive effects of Cushing’s disease and obesity together, while in the case of blood pressure, obesity appears to reduce the effects of Cushing’s disease.  </w:t>
+      </w:r>
+      <w:r>
+        <w:rPr>
+          <w:sz w:val="22"/>
+          <w:szCs w:val="22"/>
+        </w:rPr>
+        <w:t>Glucose homeostasis is consistent with an additive model in our primary dichotomous analysis, and this finding was confirmed in the more flexible spline specification where BMI was modelled as a natural cubic spline (Table 4). A linear specification produced a small significant negative interaction for glucose, but we interpret this as sensitivity of the linear model to differing BMI distributions between cases and controls rather than biological effect modification, since the more flexible spline model</w:t>
+      </w:r>
+      <w:r>
+        <w:rPr>
+          <w:sz w:val="22"/>
+          <w:szCs w:val="22"/>
+        </w:rPr>
+        <w:t xml:space="preserve"> </w:t>
+      </w:r>
+      <w:r>
+        <w:rPr>
+          <w:sz w:val="22"/>
+          <w:szCs w:val="22"/>
+        </w:rPr>
+        <w:t xml:space="preserve">showed no interaction. We </w:t>
+      </w:r>
+      <w:r>
+        <w:rPr>
+          <w:sz w:val="22"/>
+          <w:szCs w:val="22"/>
+        </w:rPr>
+        <w:t>report</w:t>
+      </w:r>
+      <w:r>
+        <w:rPr>
+          <w:sz w:val="22"/>
+          <w:szCs w:val="22"/>
+        </w:rPr>
+        <w:t xml:space="preserve"> </w:t>
+      </w:r>
+      <w:r>
+        <w:rPr>
+          <w:sz w:val="22"/>
+          <w:szCs w:val="22"/>
+        </w:rPr>
+        <w:t xml:space="preserve">positive </w:t>
+      </w:r>
+      <w:r>
+        <w:rPr>
+          <w:sz w:val="22"/>
+          <w:szCs w:val="22"/>
+        </w:rPr>
+        <w:t>effects of both obesity and Cushing's disease to independently increase blood glucose.</w:t>
       </w:r>
     </w:p>
     <w:p>
@@ -34395,6 +34588,13 @@
         </w:rPr>
         <w:t xml:space="preserve">Another possibility is there is already a ceiling effect as counter-regulatory mechanisms for blood pressure are already maximally engaged.  </w:t>
       </w:r>
+      <w:r>
+        <w:rPr>
+          <w:sz w:val="22"/>
+          <w:szCs w:val="22"/>
+        </w:rPr>
+        <w:t>Notably, when BMI was modelled as a natural cubic spline, the obesity-associated attenuation of Cushing's-related blood pressure elevation was approximately twice as large as in the dichotomous analysis (Table 4), indicating that the attenuation pattern strengthens rather than weakens under more flexible modelling of BMI and is not likely to be a threshold artifact.</w:t>
+      </w:r>
     </w:p>
     <w:p>
       <w:pPr>
@@ -34469,15 +34669,7 @@
           <w:sz w:val="22"/>
           <w:szCs w:val="22"/>
         </w:rPr>
-        <w:t xml:space="preserve">  In our view, this warrants more detailed studies on sex differences, including </w:t>
-      </w:r>
-      <w:r>
-        <w:rPr>
-          <w:sz w:val="22"/>
-          <w:szCs w:val="22"/>
-        </w:rPr>
-        <w:lastRenderedPageBreak/>
-        <w:t>the modifying effect of sex hormones on glucocorticoid signaling in the context of obesity.</w:t>
+        <w:t xml:space="preserve">  In our view, this warrants more detailed studies on sex differences, including the modifying effect of sex hormones on glucocorticoid signaling in the context of obesity.</w:t>
       </w:r>
       <w:r>
         <w:rPr>
@@ -35186,7 +35378,15 @@
           <w:sz w:val="22"/>
           <w:szCs w:val="22"/>
         </w:rPr>
-        <w:t xml:space="preserve">s dependent impacts on these co-morbidities and revealed a surprising and complex picture of integrated pathophysiology.  This study provides novel data that obesity and Cushing’s disease interact, suggesting that obesity and Cushing’s disease may result in worsened liver damage, but that the augmented effects on hypertension are lower than expected.  These results may be valuable for the accurate monitoring and treatment of </w:t>
+        <w:t xml:space="preserve">s dependent impacts on these co-morbidities and revealed a surprising and complex picture of integrated pathophysiology.  This study provides novel data that obesity and Cushing’s disease interact, suggesting that obesity and Cushing’s disease may result in worsened liver damage, but that the augmented effects on </w:t>
+      </w:r>
+      <w:r>
+        <w:rPr>
+          <w:sz w:val="22"/>
+          <w:szCs w:val="22"/>
+        </w:rPr>
+        <w:lastRenderedPageBreak/>
+        <w:t xml:space="preserve">hypertension are lower than expected.  These results may be valuable for the accurate monitoring and treatment of </w:t>
       </w:r>
       <w:proofErr w:type="gramStart"/>
       <w:r>
@@ -35210,7 +35410,6 @@
         <w:pStyle w:val="Heading1"/>
       </w:pPr>
       <w:r>
-        <w:lastRenderedPageBreak/>
         <w:t>Acknowledgements</w:t>
       </w:r>
       <w:r>
@@ -35310,7 +35509,7 @@
         </w:rPr>
         <w:t xml:space="preserve">All code used for this analysis is available at </w:t>
       </w:r>
-      <w:hyperlink r:id="rId12" w:history="1">
+      <w:hyperlink r:id="rId10" w:history="1">
         <w:r>
           <w:rPr>
             <w:rStyle w:val="Hyperlink"/>
@@ -36404,7 +36603,7 @@
       </w:r>
     </w:p>
     <w:sectPr>
-      <w:headerReference w:type="default" r:id="rId13"/>
+      <w:headerReference w:type="default" r:id="rId11"/>
       <w:pgSz w:w="12240" w:h="15840"/>
       <w:pgMar w:top="1440" w:right="1440" w:bottom="1440" w:left="1440" w:header="720" w:footer="720" w:gutter="0"/>
       <w:cols w:space="720"/>

</xml_diff>